<commit_message>
changes on internal interface
</commit_message>
<xml_diff>
--- a/Communications SRS.docx
+++ b/Communications SRS.docx
@@ -180,7 +180,7 @@
     </w:p>
     <w:tbl>
       <w:tblPr>
-        <w:tblStyle w:val="a"/>
+        <w:tblStyle w:val="a5"/>
         <w:tblW w:w="8745" w:type="dxa"/>
         <w:tblInd w:w="0" w:type="dxa"/>
         <w:tblBorders>
@@ -4294,7 +4294,7 @@
     </w:sdt>
     <w:p>
       <w:pPr>
-        <w:pStyle w:val="Heading1"/>
+        <w:pStyle w:val="1"/>
         <w:keepLines w:val="0"/>
         <w:pageBreakBefore/>
         <w:numPr>
@@ -4352,7 +4352,7 @@
     </w:p>
     <w:p>
       <w:pPr>
-        <w:pStyle w:val="Heading2"/>
+        <w:pStyle w:val="2"/>
         <w:keepLines w:val="0"/>
         <w:numPr>
           <w:ilvl w:val="1"/>
@@ -4402,7 +4402,7 @@
     </w:p>
     <w:p>
       <w:pPr>
-        <w:pStyle w:val="Heading2"/>
+        <w:pStyle w:val="2"/>
         <w:keepLines w:val="0"/>
         <w:numPr>
           <w:ilvl w:val="1"/>
@@ -4432,7 +4432,7 @@
     </w:p>
     <w:p>
       <w:pPr>
-        <w:pStyle w:val="ListParagraph"/>
+        <w:pStyle w:val="a6"/>
         <w:spacing w:before="80" w:line="240" w:lineRule="auto"/>
         <w:ind w:left="720" w:firstLineChars="0" w:firstLine="720"/>
         <w:jc w:val="both"/>
@@ -4479,7 +4479,7 @@
     </w:p>
     <w:p>
       <w:pPr>
-        <w:pStyle w:val="ListParagraph"/>
+        <w:pStyle w:val="a6"/>
         <w:spacing w:before="80" w:line="240" w:lineRule="auto"/>
         <w:ind w:left="720" w:firstLineChars="0" w:firstLine="720"/>
         <w:jc w:val="both"/>
@@ -4524,7 +4524,7 @@
     </w:p>
     <w:p>
       <w:pPr>
-        <w:pStyle w:val="ListParagraph"/>
+        <w:pStyle w:val="a6"/>
         <w:spacing w:before="80" w:line="240" w:lineRule="auto"/>
         <w:ind w:left="720" w:firstLineChars="0" w:firstLine="720"/>
         <w:jc w:val="both"/>
@@ -4569,7 +4569,7 @@
     </w:p>
     <w:p>
       <w:pPr>
-        <w:pStyle w:val="ListParagraph"/>
+        <w:pStyle w:val="a6"/>
         <w:spacing w:before="80" w:line="240" w:lineRule="auto"/>
         <w:ind w:left="720" w:firstLineChars="0" w:firstLine="720"/>
         <w:jc w:val="both"/>
@@ -4614,7 +4614,7 @@
     </w:p>
     <w:p>
       <w:pPr>
-        <w:pStyle w:val="Heading2"/>
+        <w:pStyle w:val="2"/>
         <w:keepLines w:val="0"/>
         <w:numPr>
           <w:ilvl w:val="1"/>
@@ -4747,7 +4747,7 @@
     </w:p>
     <w:p>
       <w:pPr>
-        <w:pStyle w:val="Heading2"/>
+        <w:pStyle w:val="2"/>
         <w:keepLines w:val="0"/>
         <w:numPr>
           <w:ilvl w:val="1"/>
@@ -4796,7 +4796,7 @@
     </w:p>
     <w:p>
       <w:pPr>
-        <w:pStyle w:val="Heading1"/>
+        <w:pStyle w:val="1"/>
         <w:keepLines w:val="0"/>
         <w:pageBreakBefore/>
         <w:numPr>
@@ -4834,7 +4834,7 @@
     </w:p>
     <w:p>
       <w:pPr>
-        <w:pStyle w:val="Heading2"/>
+        <w:pStyle w:val="2"/>
         <w:keepLines w:val="0"/>
         <w:numPr>
           <w:ilvl w:val="1"/>
@@ -4890,7 +4890,7 @@
     </w:p>
     <w:p>
       <w:pPr>
-        <w:pStyle w:val="Heading2"/>
+        <w:pStyle w:val="2"/>
         <w:keepLines w:val="0"/>
         <w:numPr>
           <w:ilvl w:val="1"/>
@@ -5164,7 +5164,7 @@
     </w:p>
     <w:p>
       <w:pPr>
-        <w:pStyle w:val="Heading2"/>
+        <w:pStyle w:val="2"/>
         <w:keepLines w:val="0"/>
         <w:numPr>
           <w:ilvl w:val="1"/>
@@ -5300,7 +5300,7 @@
     </w:p>
     <w:p>
       <w:pPr>
-        <w:pStyle w:val="Heading2"/>
+        <w:pStyle w:val="2"/>
         <w:keepLines w:val="0"/>
         <w:numPr>
           <w:ilvl w:val="1"/>
@@ -5430,7 +5430,7 @@
     </w:p>
     <w:p>
       <w:pPr>
-        <w:pStyle w:val="Heading2"/>
+        <w:pStyle w:val="2"/>
         <w:keepLines w:val="0"/>
         <w:numPr>
           <w:ilvl w:val="1"/>
@@ -5526,7 +5526,7 @@
     </w:p>
     <w:p>
       <w:pPr>
-        <w:pStyle w:val="Heading1"/>
+        <w:pStyle w:val="1"/>
         <w:keepLines w:val="0"/>
         <w:pageBreakBefore/>
         <w:numPr>
@@ -5564,7 +5564,7 @@
     </w:p>
     <w:p>
       <w:pPr>
-        <w:pStyle w:val="Heading3"/>
+        <w:pStyle w:val="3"/>
         <w:keepLines w:val="0"/>
         <w:numPr>
           <w:ilvl w:val="1"/>
@@ -6587,7 +6587,7 @@
     </w:p>
     <w:p>
       <w:pPr>
-        <w:pStyle w:val="Heading3"/>
+        <w:pStyle w:val="3"/>
         <w:keepLines w:val="0"/>
         <w:numPr>
           <w:ilvl w:val="1"/>
@@ -6899,7 +6899,7 @@
     </w:p>
     <w:p>
       <w:pPr>
-        <w:pStyle w:val="Heading3"/>
+        <w:pStyle w:val="3"/>
         <w:keepLines w:val="0"/>
         <w:numPr>
           <w:ilvl w:val="1"/>
@@ -7277,7 +7277,7 @@
     </w:p>
     <w:p>
       <w:pPr>
-        <w:pStyle w:val="Heading2"/>
+        <w:pStyle w:val="2"/>
         <w:keepLines w:val="0"/>
         <w:numPr>
           <w:ilvl w:val="1"/>
@@ -7307,7 +7307,7 @@
     </w:p>
     <w:p>
       <w:pPr>
-        <w:pStyle w:val="ListParagraph"/>
+        <w:pStyle w:val="a6"/>
         <w:numPr>
           <w:ilvl w:val="2"/>
           <w:numId w:val="1"/>
@@ -7345,7 +7345,7 @@
     </w:p>
     <w:p>
       <w:pPr>
-        <w:pStyle w:val="ListParagraph"/>
+        <w:pStyle w:val="a6"/>
         <w:numPr>
           <w:ilvl w:val="2"/>
           <w:numId w:val="1"/>
@@ -7394,7 +7394,7 @@
     </w:p>
     <w:p>
       <w:pPr>
-        <w:pStyle w:val="ListParagraph"/>
+        <w:pStyle w:val="a6"/>
         <w:numPr>
           <w:ilvl w:val="2"/>
           <w:numId w:val="1"/>
@@ -7423,7 +7423,7 @@
     </w:p>
     <w:p>
       <w:pPr>
-        <w:pStyle w:val="ListParagraph"/>
+        <w:pStyle w:val="a6"/>
         <w:numPr>
           <w:ilvl w:val="2"/>
           <w:numId w:val="1"/>
@@ -7452,7 +7452,7 @@
     </w:p>
     <w:p>
       <w:pPr>
-        <w:pStyle w:val="ListParagraph"/>
+        <w:pStyle w:val="a6"/>
         <w:numPr>
           <w:ilvl w:val="2"/>
           <w:numId w:val="1"/>
@@ -7481,7 +7481,7 @@
     </w:p>
     <w:p>
       <w:pPr>
-        <w:pStyle w:val="ListParagraph"/>
+        <w:pStyle w:val="a6"/>
         <w:numPr>
           <w:ilvl w:val="2"/>
           <w:numId w:val="1"/>
@@ -7510,7 +7510,7 @@
     </w:p>
     <w:p>
       <w:pPr>
-        <w:pStyle w:val="ListParagraph"/>
+        <w:pStyle w:val="a6"/>
         <w:numPr>
           <w:ilvl w:val="2"/>
           <w:numId w:val="1"/>
@@ -7539,7 +7539,7 @@
     </w:p>
     <w:p>
       <w:pPr>
-        <w:pStyle w:val="ListParagraph"/>
+        <w:pStyle w:val="a6"/>
         <w:numPr>
           <w:ilvl w:val="2"/>
           <w:numId w:val="1"/>
@@ -7588,7 +7588,7 @@
     </w:p>
     <w:p>
       <w:pPr>
-        <w:pStyle w:val="ListParagraph"/>
+        <w:pStyle w:val="a6"/>
         <w:numPr>
           <w:ilvl w:val="2"/>
           <w:numId w:val="1"/>
@@ -7617,7 +7617,7 @@
     </w:p>
     <w:p>
       <w:pPr>
-        <w:pStyle w:val="ListParagraph"/>
+        <w:pStyle w:val="a6"/>
         <w:numPr>
           <w:ilvl w:val="2"/>
           <w:numId w:val="1"/>
@@ -7646,7 +7646,7 @@
     </w:p>
     <w:p>
       <w:pPr>
-        <w:pStyle w:val="ListParagraph"/>
+        <w:pStyle w:val="a6"/>
         <w:numPr>
           <w:ilvl w:val="2"/>
           <w:numId w:val="1"/>
@@ -7675,7 +7675,7 @@
     </w:p>
     <w:p>
       <w:pPr>
-        <w:pStyle w:val="ListParagraph"/>
+        <w:pStyle w:val="a6"/>
         <w:numPr>
           <w:ilvl w:val="2"/>
           <w:numId w:val="1"/>
@@ -7724,7 +7724,7 @@
     </w:p>
     <w:p>
       <w:pPr>
-        <w:pStyle w:val="ListParagraph"/>
+        <w:pStyle w:val="a6"/>
         <w:numPr>
           <w:ilvl w:val="2"/>
           <w:numId w:val="1"/>
@@ -7753,7 +7753,7 @@
     </w:p>
     <w:p>
       <w:pPr>
-        <w:pStyle w:val="ListParagraph"/>
+        <w:pStyle w:val="a6"/>
         <w:numPr>
           <w:ilvl w:val="2"/>
           <w:numId w:val="1"/>
@@ -7782,7 +7782,7 @@
     </w:p>
     <w:p>
       <w:pPr>
-        <w:pStyle w:val="ListParagraph"/>
+        <w:pStyle w:val="a6"/>
         <w:numPr>
           <w:ilvl w:val="2"/>
           <w:numId w:val="1"/>
@@ -7811,7 +7811,7 @@
     </w:p>
     <w:p>
       <w:pPr>
-        <w:pStyle w:val="ListParagraph"/>
+        <w:pStyle w:val="a6"/>
         <w:numPr>
           <w:ilvl w:val="2"/>
           <w:numId w:val="1"/>
@@ -7860,7 +7860,7 @@
     </w:p>
     <w:p>
       <w:pPr>
-        <w:pStyle w:val="ListParagraph"/>
+        <w:pStyle w:val="a6"/>
         <w:numPr>
           <w:ilvl w:val="2"/>
           <w:numId w:val="1"/>
@@ -7889,7 +7889,7 @@
     </w:p>
     <w:p>
       <w:pPr>
-        <w:pStyle w:val="ListParagraph"/>
+        <w:pStyle w:val="a6"/>
         <w:numPr>
           <w:ilvl w:val="2"/>
           <w:numId w:val="1"/>
@@ -7919,7 +7919,7 @@
     <w:p/>
     <w:p>
       <w:pPr>
-        <w:pStyle w:val="Heading2"/>
+        <w:pStyle w:val="2"/>
         <w:keepLines w:val="0"/>
         <w:numPr>
           <w:ilvl w:val="1"/>
@@ -7951,7 +7951,7 @@
     </w:p>
     <w:p>
       <w:pPr>
-        <w:pStyle w:val="ListParagraph"/>
+        <w:pStyle w:val="a6"/>
         <w:numPr>
           <w:ilvl w:val="2"/>
           <w:numId w:val="1"/>
@@ -7969,12 +7969,59 @@
           <w:sz w:val="20"/>
           <w:szCs w:val="20"/>
         </w:rPr>
-        <w:t>The communication service module shall provide internal service interfaces to the Client module and the IT module.</w:t>
-      </w:r>
-    </w:p>
-    <w:p>
-      <w:pPr>
-        <w:pStyle w:val="ListParagraph"/>
+        <w:t>The communication</w:t>
+      </w:r>
+      <w:r>
+        <w:rPr>
+          <w:rFonts w:ascii="Times New Roman" w:hAnsi="Times New Roman" w:cs="Times New Roman" w:hint="eastAsia"/>
+          <w:sz w:val="20"/>
+          <w:szCs w:val="20"/>
+          <w:lang w:eastAsia="zh-CN"/>
+        </w:rPr>
+        <w:t xml:space="preserve"> </w:t>
+      </w:r>
+      <w:r>
+        <w:rPr>
+          <w:rFonts w:ascii="Times New Roman" w:hAnsi="Times New Roman" w:cs="Times New Roman"/>
+          <w:sz w:val="20"/>
+          <w:szCs w:val="20"/>
+          <w:lang w:eastAsia="zh-CN"/>
+        </w:rPr>
+        <w:t xml:space="preserve">server </w:t>
+      </w:r>
+      <w:proofErr w:type="gramStart"/>
+      <w:r>
+        <w:rPr>
+          <w:rFonts w:ascii="Times New Roman" w:hAnsi="Times New Roman" w:cs="Times New Roman"/>
+          <w:sz w:val="20"/>
+          <w:szCs w:val="20"/>
+          <w:lang w:eastAsia="zh-CN"/>
+        </w:rPr>
+        <w:t>module</w:t>
+      </w:r>
+      <w:r>
+        <w:rPr>
+          <w:rFonts w:ascii="Times New Roman" w:hAnsi="Times New Roman" w:cs="Times New Roman" w:hint="eastAsia"/>
+          <w:sz w:val="20"/>
+          <w:szCs w:val="20"/>
+          <w:lang w:eastAsia="zh-CN"/>
+        </w:rPr>
+        <w:t xml:space="preserve"> shall</w:t>
+      </w:r>
+      <w:proofErr w:type="gramEnd"/>
+      <w:r>
+        <w:rPr>
+          <w:rFonts w:ascii="Times New Roman" w:hAnsi="Times New Roman" w:cs="Times New Roman" w:hint="eastAsia"/>
+          <w:sz w:val="20"/>
+          <w:szCs w:val="20"/>
+          <w:lang w:eastAsia="zh-CN"/>
+        </w:rPr>
+        <w:t xml:space="preserve"> provide internal service interfaces for the login module, client module and IT module to request authentication, messaging and administrative access. </w:t>
+      </w:r>
+    </w:p>
+    <w:p>
+      <w:pPr>
+        <w:pStyle w:val="a6"/>
         <w:numPr>
           <w:ilvl w:val="2"/>
           <w:numId w:val="1"/>
@@ -7991,13 +8038,23 @@
           <w:rFonts w:ascii="Times New Roman" w:hAnsi="Times New Roman" w:cs="Times New Roman"/>
           <w:sz w:val="20"/>
           <w:szCs w:val="20"/>
-        </w:rPr>
-        <w:t>The Communication service module shall provide username and password validation, return authentication and associated user session information.</w:t>
-      </w:r>
-    </w:p>
-    <w:p>
-      <w:pPr>
-        <w:pStyle w:val="ListParagraph"/>
+          <w:lang w:eastAsia="zh-CN"/>
+        </w:rPr>
+        <w:t>T</w:t>
+      </w:r>
+      <w:r>
+        <w:rPr>
+          <w:rFonts w:ascii="Times New Roman" w:hAnsi="Times New Roman" w:cs="Times New Roman" w:hint="eastAsia"/>
+          <w:sz w:val="20"/>
+          <w:szCs w:val="20"/>
+          <w:lang w:eastAsia="zh-CN"/>
+        </w:rPr>
+        <w:t>he login module shall send authentication requests containing username and password to the communication server module.</w:t>
+      </w:r>
+    </w:p>
+    <w:p>
+      <w:pPr>
+        <w:pStyle w:val="a6"/>
         <w:numPr>
           <w:ilvl w:val="2"/>
           <w:numId w:val="1"/>
@@ -8014,13 +8071,41 @@
           <w:rFonts w:ascii="Times New Roman" w:hAnsi="Times New Roman" w:cs="Times New Roman"/>
           <w:sz w:val="20"/>
           <w:szCs w:val="20"/>
-        </w:rPr>
-        <w:t>The Communication service module shall provide username and password validation, return authentication and associated user session information.</w:t>
-      </w:r>
-    </w:p>
-    <w:p>
-      <w:pPr>
-        <w:pStyle w:val="ListParagraph"/>
+          <w:lang w:eastAsia="zh-CN"/>
+        </w:rPr>
+        <w:t>T</w:t>
+      </w:r>
+      <w:r>
+        <w:rPr>
+          <w:rFonts w:ascii="Times New Roman" w:hAnsi="Times New Roman" w:cs="Times New Roman" w:hint="eastAsia"/>
+          <w:sz w:val="20"/>
+          <w:szCs w:val="20"/>
+          <w:lang w:eastAsia="zh-CN"/>
+        </w:rPr>
+        <w:t xml:space="preserve">he communication server module shall validate authentication requests and return authentication </w:t>
+      </w:r>
+      <w:r>
+        <w:rPr>
+          <w:rFonts w:ascii="Times New Roman" w:hAnsi="Times New Roman" w:cs="Times New Roman"/>
+          <w:sz w:val="20"/>
+          <w:szCs w:val="20"/>
+          <w:lang w:eastAsia="zh-CN"/>
+        </w:rPr>
+        <w:t>results</w:t>
+      </w:r>
+      <w:r>
+        <w:rPr>
+          <w:rFonts w:ascii="Times New Roman" w:hAnsi="Times New Roman" w:cs="Times New Roman" w:hint="eastAsia"/>
+          <w:sz w:val="20"/>
+          <w:szCs w:val="20"/>
+          <w:lang w:eastAsia="zh-CN"/>
+        </w:rPr>
+        <w:t>.</w:t>
+      </w:r>
+    </w:p>
+    <w:p>
+      <w:pPr>
+        <w:pStyle w:val="a6"/>
         <w:numPr>
           <w:ilvl w:val="2"/>
           <w:numId w:val="1"/>
@@ -8037,13 +8122,32 @@
           <w:rFonts w:ascii="Times New Roman" w:hAnsi="Times New Roman" w:cs="Times New Roman"/>
           <w:sz w:val="20"/>
           <w:szCs w:val="20"/>
-        </w:rPr>
-        <w:t>The Communication service module shall provide a service to create private chats, group chats, add users to groups chats, retrieve user chat list.</w:t>
-      </w:r>
-    </w:p>
-    <w:p>
-      <w:pPr>
-        <w:pStyle w:val="ListParagraph"/>
+          <w:lang w:eastAsia="zh-CN"/>
+        </w:rPr>
+        <w:t>W</w:t>
+      </w:r>
+      <w:r>
+        <w:rPr>
+          <w:rFonts w:ascii="Times New Roman" w:hAnsi="Times New Roman" w:cs="Times New Roman" w:hint="eastAsia"/>
+          <w:sz w:val="20"/>
+          <w:szCs w:val="20"/>
+          <w:lang w:eastAsia="zh-CN"/>
+        </w:rPr>
+        <w:t>ith successful authentication the communication server module shall return the authenticated user role and session information to the requesting module.</w:t>
+      </w:r>
+      <w:r>
+        <w:rPr>
+          <w:rFonts w:ascii="Times New Roman" w:hAnsi="Times New Roman" w:cs="Times New Roman" w:hint="eastAsia"/>
+          <w:sz w:val="20"/>
+          <w:szCs w:val="20"/>
+          <w:lang w:eastAsia="zh-CN"/>
+        </w:rPr>
+        <w:t xml:space="preserve"> </w:t>
+      </w:r>
+    </w:p>
+    <w:p>
+      <w:pPr>
+        <w:pStyle w:val="a6"/>
         <w:numPr>
           <w:ilvl w:val="2"/>
           <w:numId w:val="1"/>
@@ -8061,12 +8165,95 @@
           <w:sz w:val="20"/>
           <w:szCs w:val="20"/>
         </w:rPr>
-        <w:t>The Communication service module shall provide a method to submit a message to a chat, store the message, maintain message order within the conversation and broadcast message to online users.</w:t>
-      </w:r>
-    </w:p>
-    <w:p>
-      <w:pPr>
-        <w:pStyle w:val="ListParagraph"/>
+        <w:t xml:space="preserve">The Communication </w:t>
+      </w:r>
+      <w:r>
+        <w:rPr>
+          <w:rFonts w:ascii="Times New Roman" w:hAnsi="Times New Roman" w:cs="Times New Roman" w:hint="eastAsia"/>
+          <w:sz w:val="20"/>
+          <w:szCs w:val="20"/>
+          <w:lang w:eastAsia="zh-CN"/>
+        </w:rPr>
+        <w:t>server</w:t>
+      </w:r>
+      <w:r>
+        <w:rPr>
+          <w:rFonts w:ascii="Times New Roman" w:hAnsi="Times New Roman" w:cs="Times New Roman"/>
+          <w:sz w:val="20"/>
+          <w:szCs w:val="20"/>
+        </w:rPr>
+        <w:t xml:space="preserve"> module shall provide </w:t>
+      </w:r>
+      <w:r>
+        <w:rPr>
+          <w:rFonts w:ascii="Times New Roman" w:hAnsi="Times New Roman" w:cs="Times New Roman" w:hint="eastAsia"/>
+          <w:sz w:val="20"/>
+          <w:szCs w:val="20"/>
+          <w:lang w:eastAsia="zh-CN"/>
+        </w:rPr>
+        <w:t xml:space="preserve">Client module </w:t>
+      </w:r>
+      <w:r>
+        <w:rPr>
+          <w:rFonts w:ascii="Times New Roman" w:hAnsi="Times New Roman" w:cs="Times New Roman"/>
+          <w:sz w:val="20"/>
+          <w:szCs w:val="20"/>
+        </w:rPr>
+        <w:t xml:space="preserve">service to create private chats, group chats, add users to </w:t>
+      </w:r>
+      <w:r>
+        <w:rPr>
+          <w:rFonts w:ascii="Times New Roman" w:hAnsi="Times New Roman" w:cs="Times New Roman"/>
+          <w:sz w:val="20"/>
+          <w:szCs w:val="20"/>
+        </w:rPr>
+        <w:t>group</w:t>
+      </w:r>
+      <w:r>
+        <w:rPr>
+          <w:rFonts w:ascii="Times New Roman" w:hAnsi="Times New Roman" w:cs="Times New Roman"/>
+          <w:sz w:val="20"/>
+          <w:szCs w:val="20"/>
+        </w:rPr>
+        <w:t xml:space="preserve"> chats</w:t>
+      </w:r>
+      <w:r>
+        <w:rPr>
+          <w:rFonts w:ascii="Times New Roman" w:hAnsi="Times New Roman" w:cs="Times New Roman"/>
+          <w:sz w:val="20"/>
+          <w:szCs w:val="20"/>
+        </w:rPr>
+        <w:t>, and retrieve</w:t>
+      </w:r>
+      <w:r>
+        <w:rPr>
+          <w:rFonts w:ascii="Times New Roman" w:hAnsi="Times New Roman" w:cs="Times New Roman"/>
+          <w:sz w:val="20"/>
+          <w:szCs w:val="20"/>
+        </w:rPr>
+        <w:t xml:space="preserve"> user chat list</w:t>
+      </w:r>
+      <w:r>
+        <w:rPr>
+          <w:rFonts w:ascii="Times New Roman" w:hAnsi="Times New Roman" w:cs="Times New Roman" w:hint="eastAsia"/>
+          <w:sz w:val="20"/>
+          <w:szCs w:val="20"/>
+          <w:lang w:eastAsia="zh-CN"/>
+        </w:rPr>
+        <w:t>s</w:t>
+      </w:r>
+      <w:r>
+        <w:rPr>
+          <w:rFonts w:ascii="Times New Roman" w:hAnsi="Times New Roman" w:cs="Times New Roman"/>
+          <w:sz w:val="20"/>
+          <w:szCs w:val="20"/>
+        </w:rPr>
+        <w:t>.</w:t>
+      </w:r>
+    </w:p>
+    <w:p>
+      <w:pPr>
+        <w:pStyle w:val="a6"/>
         <w:numPr>
           <w:ilvl w:val="2"/>
           <w:numId w:val="1"/>
@@ -8084,35 +8271,69 @@
           <w:sz w:val="20"/>
           <w:szCs w:val="20"/>
         </w:rPr>
-        <w:t>The Communication service module shall provide a method to retrieve message history, retrieve unread message, mark message as read.</w:t>
-      </w:r>
-    </w:p>
-    <w:p>
-      <w:pPr>
-        <w:pStyle w:val="ListParagraph"/>
+        <w:t xml:space="preserve">The Communication </w:t>
+      </w:r>
+      <w:r>
+        <w:rPr>
+          <w:rFonts w:ascii="Times New Roman" w:hAnsi="Times New Roman" w:cs="Times New Roman" w:hint="eastAsia"/>
+          <w:sz w:val="20"/>
+          <w:szCs w:val="20"/>
+          <w:lang w:eastAsia="zh-CN"/>
+        </w:rPr>
+        <w:t>server</w:t>
+      </w:r>
+      <w:r>
+        <w:rPr>
+          <w:rFonts w:ascii="Times New Roman" w:hAnsi="Times New Roman" w:cs="Times New Roman"/>
+          <w:sz w:val="20"/>
+          <w:szCs w:val="20"/>
+        </w:rPr>
+        <w:t xml:space="preserve"> module shall provide a method to submit a message to a chat, store the message, maintain message order within the conversation and broadcast message to online users.</w:t>
+      </w:r>
+    </w:p>
+    <w:p>
+      <w:pPr>
+        <w:pStyle w:val="a6"/>
         <w:numPr>
           <w:ilvl w:val="2"/>
           <w:numId w:val="1"/>
         </w:numPr>
         <w:ind w:firstLineChars="0"/>
         <w:rPr>
-          <w:rFonts w:ascii="Times New Roman" w:hAnsi="Times New Roman" w:cs="Times New Roman"/>
-          <w:sz w:val="20"/>
-          <w:szCs w:val="20"/>
-        </w:rPr>
-      </w:pPr>
-      <w:r>
-        <w:rPr>
-          <w:rFonts w:ascii="Times New Roman" w:hAnsi="Times New Roman" w:cs="Times New Roman"/>
-          <w:sz w:val="20"/>
-          <w:szCs w:val="20"/>
-        </w:rPr>
-        <w:t>The Communication Service module shall notify Client module when new message is received, user is invited to a group chat.</w:t>
-      </w:r>
-    </w:p>
-    <w:p>
-      <w:pPr>
-        <w:pStyle w:val="ListParagraph"/>
+          <w:rFonts w:ascii="Times New Roman" w:hAnsi="Times New Roman" w:cs="Times New Roman" w:hint="eastAsia"/>
+          <w:sz w:val="20"/>
+          <w:szCs w:val="20"/>
+        </w:rPr>
+      </w:pPr>
+      <w:r>
+        <w:rPr>
+          <w:rFonts w:ascii="Times New Roman" w:hAnsi="Times New Roman" w:cs="Times New Roman"/>
+          <w:sz w:val="20"/>
+          <w:szCs w:val="20"/>
+        </w:rPr>
+        <w:t xml:space="preserve">The Communication </w:t>
+      </w:r>
+      <w:r>
+        <w:rPr>
+          <w:rFonts w:ascii="Times New Roman" w:hAnsi="Times New Roman" w:cs="Times New Roman" w:hint="eastAsia"/>
+          <w:sz w:val="20"/>
+          <w:szCs w:val="20"/>
+          <w:lang w:eastAsia="zh-CN"/>
+        </w:rPr>
+        <w:t xml:space="preserve">server </w:t>
+      </w:r>
+      <w:r>
+        <w:rPr>
+          <w:rFonts w:ascii="Times New Roman" w:hAnsi="Times New Roman" w:cs="Times New Roman"/>
+          <w:sz w:val="20"/>
+          <w:szCs w:val="20"/>
+        </w:rPr>
+        <w:t>module shall provide a method to retrieve message history, retrieve unread message, mark message as read.</w:t>
+      </w:r>
+    </w:p>
+    <w:p>
+      <w:pPr>
+        <w:pStyle w:val="a6"/>
         <w:numPr>
           <w:ilvl w:val="2"/>
           <w:numId w:val="1"/>
@@ -8130,12 +8351,29 @@
           <w:sz w:val="20"/>
           <w:szCs w:val="20"/>
         </w:rPr>
-        <w:t>The Communication service module shall provide internal access to the IT module to allow viewing all conversation, all users, message history by user, and message history by chat.</w:t>
-      </w:r>
-    </w:p>
-    <w:p>
-      <w:pPr>
-        <w:pStyle w:val="ListParagraph"/>
+        <w:t xml:space="preserve">The Communication </w:t>
+      </w:r>
+      <w:r>
+        <w:rPr>
+          <w:rFonts w:ascii="Times New Roman" w:hAnsi="Times New Roman" w:cs="Times New Roman" w:hint="eastAsia"/>
+          <w:sz w:val="20"/>
+          <w:szCs w:val="20"/>
+          <w:lang w:eastAsia="zh-CN"/>
+        </w:rPr>
+        <w:t>server</w:t>
+      </w:r>
+      <w:r>
+        <w:rPr>
+          <w:rFonts w:ascii="Times New Roman" w:hAnsi="Times New Roman" w:cs="Times New Roman"/>
+          <w:sz w:val="20"/>
+          <w:szCs w:val="20"/>
+        </w:rPr>
+        <w:t xml:space="preserve"> module shall notify Client module when new message is received, user is invited to a group chat.</w:t>
+      </w:r>
+    </w:p>
+    <w:p>
+      <w:pPr>
+        <w:pStyle w:val="a6"/>
         <w:numPr>
           <w:ilvl w:val="2"/>
           <w:numId w:val="1"/>
@@ -8152,6 +8390,46 @@
           <w:rFonts w:ascii="Times New Roman" w:hAnsi="Times New Roman" w:cs="Times New Roman"/>
           <w:sz w:val="20"/>
           <w:szCs w:val="20"/>
+        </w:rPr>
+        <w:t xml:space="preserve">The Communication </w:t>
+      </w:r>
+      <w:r>
+        <w:rPr>
+          <w:rFonts w:ascii="Times New Roman" w:hAnsi="Times New Roman" w:cs="Times New Roman" w:hint="eastAsia"/>
+          <w:sz w:val="20"/>
+          <w:szCs w:val="20"/>
+          <w:lang w:eastAsia="zh-CN"/>
+        </w:rPr>
+        <w:t>server</w:t>
+      </w:r>
+      <w:r>
+        <w:rPr>
+          <w:rFonts w:ascii="Times New Roman" w:hAnsi="Times New Roman" w:cs="Times New Roman"/>
+          <w:sz w:val="20"/>
+          <w:szCs w:val="20"/>
+        </w:rPr>
+        <w:t xml:space="preserve"> module shall provide internal access to the IT module to allow viewing all conversation, all users, message history by user, and message history by chat.</w:t>
+      </w:r>
+    </w:p>
+    <w:p>
+      <w:pPr>
+        <w:pStyle w:val="a6"/>
+        <w:numPr>
+          <w:ilvl w:val="2"/>
+          <w:numId w:val="1"/>
+        </w:numPr>
+        <w:ind w:firstLineChars="0"/>
+        <w:rPr>
+          <w:rFonts w:ascii="Times New Roman" w:hAnsi="Times New Roman" w:cs="Times New Roman"/>
+          <w:sz w:val="20"/>
+          <w:szCs w:val="20"/>
+        </w:rPr>
+      </w:pPr>
+      <w:r>
+        <w:rPr>
+          <w:rFonts w:ascii="Times New Roman" w:hAnsi="Times New Roman" w:cs="Times New Roman"/>
+          <w:sz w:val="20"/>
+          <w:szCs w:val="20"/>
           <w:lang w:eastAsia="zh-CN"/>
         </w:rPr>
         <w:t>All messages shall be stored in structured documents.</w:t>
@@ -8159,35 +8437,126 @@
     </w:p>
     <w:p>
       <w:pPr>
-        <w:spacing w:line="240" w:lineRule="auto"/>
-        <w:ind w:left="1440"/>
-        <w:rPr>
-          <w:rFonts w:ascii="Times New Roman" w:eastAsia="Times New Roman" w:hAnsi="Times New Roman" w:cs="Times New Roman"/>
-          <w:b/>
-          <w:bCs/>
-          <w:color w:val="7030A0"/>
-          <w:sz w:val="20"/>
-          <w:szCs w:val="20"/>
-        </w:rPr>
-      </w:pPr>
-    </w:p>
-    <w:p>
-      <w:pPr>
-        <w:spacing w:line="240" w:lineRule="auto"/>
-        <w:ind w:left="1440"/>
-        <w:rPr>
-          <w:rFonts w:ascii="Times New Roman" w:eastAsia="Times New Roman" w:hAnsi="Times New Roman" w:cs="Times New Roman"/>
-          <w:b/>
-          <w:bCs/>
-          <w:color w:val="7030A0"/>
-          <w:sz w:val="20"/>
-          <w:szCs w:val="20"/>
-        </w:rPr>
-      </w:pPr>
-    </w:p>
-    <w:p>
-      <w:pPr>
-        <w:pStyle w:val="Heading1"/>
+        <w:pStyle w:val="a6"/>
+        <w:numPr>
+          <w:ilvl w:val="2"/>
+          <w:numId w:val="1"/>
+        </w:numPr>
+        <w:ind w:firstLineChars="0"/>
+        <w:rPr>
+          <w:rFonts w:ascii="Times New Roman" w:hAnsi="Times New Roman" w:cs="Times New Roman"/>
+          <w:sz w:val="20"/>
+          <w:szCs w:val="20"/>
+        </w:rPr>
+      </w:pPr>
+      <w:r>
+        <w:rPr>
+          <w:rFonts w:ascii="Times New Roman" w:hAnsi="Times New Roman" w:cs="Times New Roman"/>
+          <w:sz w:val="20"/>
+          <w:szCs w:val="20"/>
+          <w:lang w:eastAsia="zh-CN"/>
+        </w:rPr>
+        <w:t>T</w:t>
+      </w:r>
+      <w:r>
+        <w:rPr>
+          <w:rFonts w:ascii="Times New Roman" w:hAnsi="Times New Roman" w:cs="Times New Roman" w:hint="eastAsia"/>
+          <w:sz w:val="20"/>
+          <w:szCs w:val="20"/>
+          <w:lang w:eastAsia="zh-CN"/>
+        </w:rPr>
+        <w:t xml:space="preserve">he communication server module shall handle concurrent service </w:t>
+      </w:r>
+      <w:r>
+        <w:rPr>
+          <w:rFonts w:ascii="Times New Roman" w:hAnsi="Times New Roman" w:cs="Times New Roman"/>
+          <w:sz w:val="20"/>
+          <w:szCs w:val="20"/>
+          <w:lang w:eastAsia="zh-CN"/>
+        </w:rPr>
+        <w:t>requests</w:t>
+      </w:r>
+      <w:r>
+        <w:rPr>
+          <w:rFonts w:ascii="Times New Roman" w:hAnsi="Times New Roman" w:cs="Times New Roman" w:hint="eastAsia"/>
+          <w:sz w:val="20"/>
+          <w:szCs w:val="20"/>
+          <w:lang w:eastAsia="zh-CN"/>
+        </w:rPr>
+        <w:t xml:space="preserve"> from multiple Client modules and IT modules</w:t>
+      </w:r>
+    </w:p>
+    <w:p>
+      <w:pPr>
+        <w:pStyle w:val="a6"/>
+        <w:numPr>
+          <w:ilvl w:val="2"/>
+          <w:numId w:val="1"/>
+        </w:numPr>
+        <w:ind w:firstLineChars="0"/>
+        <w:rPr>
+          <w:rFonts w:ascii="Times New Roman" w:hAnsi="Times New Roman" w:cs="Times New Roman"/>
+          <w:sz w:val="20"/>
+          <w:szCs w:val="20"/>
+        </w:rPr>
+      </w:pPr>
+      <w:r>
+        <w:rPr>
+          <w:rFonts w:ascii="Times New Roman" w:hAnsi="Times New Roman" w:cs="Times New Roman" w:hint="eastAsia"/>
+          <w:sz w:val="20"/>
+          <w:szCs w:val="20"/>
+          <w:lang w:eastAsia="zh-CN"/>
+        </w:rPr>
+        <w:t xml:space="preserve">The communication server module shall provide the IT module with </w:t>
+      </w:r>
+      <w:proofErr w:type="gramStart"/>
+      <w:r>
+        <w:rPr>
+          <w:rFonts w:ascii="Times New Roman" w:hAnsi="Times New Roman" w:cs="Times New Roman" w:hint="eastAsia"/>
+          <w:sz w:val="20"/>
+          <w:szCs w:val="20"/>
+          <w:lang w:eastAsia="zh-CN"/>
+        </w:rPr>
+        <w:t>read</w:t>
+      </w:r>
+      <w:proofErr w:type="gramEnd"/>
+      <w:r>
+        <w:rPr>
+          <w:rFonts w:ascii="Times New Roman" w:hAnsi="Times New Roman" w:cs="Times New Roman" w:hint="eastAsia"/>
+          <w:sz w:val="20"/>
+          <w:szCs w:val="20"/>
+          <w:lang w:eastAsia="zh-CN"/>
+        </w:rPr>
+        <w:t>-only access interface.</w:t>
+      </w:r>
+    </w:p>
+    <w:p>
+      <w:pPr>
+        <w:pStyle w:val="a6"/>
+        <w:numPr>
+          <w:ilvl w:val="2"/>
+          <w:numId w:val="1"/>
+        </w:numPr>
+        <w:ind w:firstLineChars="0"/>
+        <w:rPr>
+          <w:rFonts w:ascii="Times New Roman" w:hAnsi="Times New Roman" w:cs="Times New Roman" w:hint="eastAsia"/>
+          <w:sz w:val="20"/>
+          <w:szCs w:val="20"/>
+        </w:rPr>
+      </w:pPr>
+      <w:r>
+        <w:rPr>
+          <w:rFonts w:ascii="Times New Roman" w:hAnsi="Times New Roman" w:cs="Times New Roman" w:hint="eastAsia"/>
+          <w:sz w:val="20"/>
+          <w:szCs w:val="20"/>
+          <w:lang w:eastAsia="zh-CN"/>
+        </w:rPr>
+        <w:t>All internal service interfaces between modules shall follow standard object-oriented interface design.</w:t>
+      </w:r>
+    </w:p>
+    <w:p>
+      <w:pPr>
+        <w:pStyle w:val="1"/>
         <w:keepLines w:val="0"/>
         <w:pageBreakBefore/>
         <w:pBdr>
@@ -8222,7 +8591,7 @@
     </w:p>
     <w:p>
       <w:pPr>
-        <w:pStyle w:val="Heading2"/>
+        <w:pStyle w:val="2"/>
         <w:keepLines w:val="0"/>
         <w:numPr>
           <w:ilvl w:val="1"/>
@@ -8818,7 +9187,7 @@
     </w:p>
     <w:p>
       <w:pPr>
-        <w:pStyle w:val="Heading2"/>
+        <w:pStyle w:val="2"/>
         <w:keepLines w:val="0"/>
         <w:numPr>
           <w:ilvl w:val="1"/>
@@ -9122,7 +9491,7 @@
     </w:p>
     <w:p>
       <w:pPr>
-        <w:pStyle w:val="Heading2"/>
+        <w:pStyle w:val="2"/>
         <w:keepLines w:val="0"/>
         <w:numPr>
           <w:ilvl w:val="1"/>
@@ -9504,7 +9873,7 @@
     </w:p>
     <w:p>
       <w:pPr>
-        <w:pStyle w:val="Heading2"/>
+        <w:pStyle w:val="2"/>
         <w:keepLines w:val="0"/>
         <w:spacing w:before="240" w:after="60" w:line="240" w:lineRule="auto"/>
         <w:ind w:left="1440"/>
@@ -9517,7 +9886,6 @@
       </w:pPr>
     </w:p>
     <w:sectPr>
-      <w:headerReference w:type="default" r:id="rId8"/>
       <w:pgSz w:w="12240" w:h="15840"/>
       <w:pgMar w:top="1440" w:right="1440" w:bottom="1440" w:left="1440" w:header="720" w:footer="720" w:gutter="0"/>
       <w:pgNumType w:start="1"/>
@@ -9575,12 +9943,6 @@
     </w:p>
   </w:footnote>
 </w:footnotes>
-</file>
-
-<file path=word/header1.xml><?xml version="1.0" encoding="utf-8"?>
-<w:hdr xmlns:wpc="http://schemas.microsoft.com/office/word/2010/wordprocessingCanvas" xmlns:cx="http://schemas.microsoft.com/office/drawing/2014/chartex" xmlns:cx1="http://schemas.microsoft.com/office/drawing/2015/9/8/chartex" xmlns:cx2="http://schemas.microsoft.com/office/drawing/2015/10/21/chartex" xmlns:cx3="http://schemas.microsoft.com/office/drawing/2016/5/9/chartex" xmlns:cx4="http://schemas.microsoft.com/office/drawing/2016/5/10/chartex" xmlns:cx5="http://schemas.microsoft.com/office/drawing/2016/5/11/chartex" xmlns:cx6="http://schemas.microsoft.com/office/drawing/2016/5/12/chartex" xmlns:cx7="http://schemas.microsoft.com/office/drawing/2016/5/13/chartex" xmlns:cx8="http://schemas.microsoft.com/office/drawing/2016/5/14/chartex" xmlns:mc="http://schemas.openxmlformats.org/markup-compatibility/2006" xmlns:aink="http://schemas.microsoft.com/office/drawing/2016/ink" xmlns:am3d="http://schemas.microsoft.com/office/drawing/2017/model3d" xmlns:o="urn:schemas-microsoft-com:office:office" xmlns:oel="http://schemas.microsoft.com/office/2019/extlst" xmlns:r="http://schemas.openxmlformats.org/officeDocument/2006/relationships" xmlns:m="http://schemas.openxmlformats.org/officeDocument/2006/math" xmlns:v="urn:schemas-microsoft-com:vml" xmlns:wp14="http://schemas.microsoft.com/office/word/2010/wordprocessingDrawing" xmlns:wp="http://schemas.openxmlformats.org/drawingml/2006/wordprocessingDrawing" xmlns:w10="urn:schemas-microsoft-com:office:word" xmlns:w="http://schemas.openxmlformats.org/wordprocessingml/2006/main" xmlns:w14="http://schemas.microsoft.com/office/word/2010/wordml" xmlns:w15="http://schemas.microsoft.com/office/word/2012/wordml" xmlns:w16cex="http://schemas.microsoft.com/office/word/2018/wordml/cex" xmlns:w16cid="http://schemas.microsoft.com/office/word/2016/wordml/cid" xmlns:w16="http://schemas.microsoft.com/office/word/2018/wordml" xmlns:w16du="http://schemas.microsoft.com/office/word/2023/wordml/word16du" xmlns:w16sdtdh="http://schemas.microsoft.com/office/word/2020/wordml/sdtdatahash" xmlns:w16sdtfl="http://schemas.microsoft.com/office/word/2024/wordml/sdtformatlock" xmlns:w16se="http://schemas.microsoft.com/office/word/2015/wordml/symex" xmlns:wpg="http://schemas.microsoft.com/office/word/2010/wordprocessingGroup" xmlns:wpi="http://schemas.microsoft.com/office/word/2010/wordprocessingInk" xmlns:wne="http://schemas.microsoft.com/office/word/2006/wordml" xmlns:wps="http://schemas.microsoft.com/office/word/2010/wordprocessingShape" mc:Ignorable="w14 w15 w16se w16cid w16 w16cex w16sdtdh w16sdtfl w16du wp14">
-  <w:p/>
-</w:hdr>
 </file>
 
 <file path=word/numbering.xml><?xml version="1.0" encoding="utf-8"?>
@@ -11044,15 +11406,15 @@
     <w:lsdException w:name="Unresolved Mention" w:semiHidden="1" w:unhideWhenUsed="1"/>
     <w:lsdException w:name="Smart Link" w:semiHidden="1" w:unhideWhenUsed="1"/>
   </w:latentStyles>
-  <w:style w:type="paragraph" w:default="1" w:styleId="Normal">
+  <w:style w:type="paragraph" w:default="1" w:styleId="a">
     <w:name w:val="Normal"/>
     <w:qFormat/>
     <w:rsid w:val="00455915"/>
   </w:style>
-  <w:style w:type="paragraph" w:styleId="Heading1">
+  <w:style w:type="paragraph" w:styleId="1">
     <w:name w:val="heading 1"/>
-    <w:basedOn w:val="Normal"/>
-    <w:next w:val="Normal"/>
+    <w:basedOn w:val="a"/>
+    <w:next w:val="a"/>
     <w:uiPriority w:val="9"/>
     <w:qFormat/>
     <w:pPr>
@@ -11066,11 +11428,11 @@
       <w:szCs w:val="40"/>
     </w:rPr>
   </w:style>
-  <w:style w:type="paragraph" w:styleId="Heading2">
+  <w:style w:type="paragraph" w:styleId="2">
     <w:name w:val="heading 2"/>
-    <w:basedOn w:val="Normal"/>
-    <w:next w:val="Normal"/>
-    <w:link w:val="Heading2Char"/>
+    <w:basedOn w:val="a"/>
+    <w:next w:val="a"/>
+    <w:link w:val="20"/>
     <w:uiPriority w:val="9"/>
     <w:unhideWhenUsed/>
     <w:qFormat/>
@@ -11085,10 +11447,10 @@
       <w:szCs w:val="32"/>
     </w:rPr>
   </w:style>
-  <w:style w:type="paragraph" w:styleId="Heading3">
+  <w:style w:type="paragraph" w:styleId="3">
     <w:name w:val="heading 3"/>
-    <w:basedOn w:val="Normal"/>
-    <w:next w:val="Normal"/>
+    <w:basedOn w:val="a"/>
+    <w:next w:val="a"/>
     <w:uiPriority w:val="9"/>
     <w:unhideWhenUsed/>
     <w:qFormat/>
@@ -11104,10 +11466,10 @@
       <w:szCs w:val="28"/>
     </w:rPr>
   </w:style>
-  <w:style w:type="paragraph" w:styleId="Heading4">
+  <w:style w:type="paragraph" w:styleId="4">
     <w:name w:val="heading 4"/>
-    <w:basedOn w:val="Normal"/>
-    <w:next w:val="Normal"/>
+    <w:basedOn w:val="a"/>
+    <w:next w:val="a"/>
     <w:uiPriority w:val="9"/>
     <w:semiHidden/>
     <w:unhideWhenUsed/>
@@ -11124,10 +11486,10 @@
       <w:szCs w:val="24"/>
     </w:rPr>
   </w:style>
-  <w:style w:type="paragraph" w:styleId="Heading5">
+  <w:style w:type="paragraph" w:styleId="5">
     <w:name w:val="heading 5"/>
-    <w:basedOn w:val="Normal"/>
-    <w:next w:val="Normal"/>
+    <w:basedOn w:val="a"/>
+    <w:next w:val="a"/>
     <w:uiPriority w:val="9"/>
     <w:semiHidden/>
     <w:unhideWhenUsed/>
@@ -11142,10 +11504,10 @@
       <w:color w:val="666666"/>
     </w:rPr>
   </w:style>
-  <w:style w:type="paragraph" w:styleId="Heading6">
+  <w:style w:type="paragraph" w:styleId="6">
     <w:name w:val="heading 6"/>
-    <w:basedOn w:val="Normal"/>
-    <w:next w:val="Normal"/>
+    <w:basedOn w:val="a"/>
+    <w:next w:val="a"/>
     <w:uiPriority w:val="9"/>
     <w:semiHidden/>
     <w:unhideWhenUsed/>
@@ -11162,13 +11524,13 @@
       <w:color w:val="666666"/>
     </w:rPr>
   </w:style>
-  <w:style w:type="character" w:default="1" w:styleId="DefaultParagraphFont">
+  <w:style w:type="character" w:default="1" w:styleId="a0">
     <w:name w:val="Default Paragraph Font"/>
     <w:uiPriority w:val="1"/>
     <w:semiHidden/>
     <w:unhideWhenUsed/>
   </w:style>
-  <w:style w:type="table" w:default="1" w:styleId="TableNormal">
+  <w:style w:type="table" w:default="1" w:styleId="a1">
     <w:name w:val="Normal Table"/>
     <w:uiPriority w:val="99"/>
     <w:semiHidden/>
@@ -11183,13 +11545,13 @@
       </w:tblCellMar>
     </w:tblPr>
   </w:style>
-  <w:style w:type="numbering" w:default="1" w:styleId="NoList">
+  <w:style w:type="numbering" w:default="1" w:styleId="a2">
     <w:name w:val="No List"/>
     <w:uiPriority w:val="99"/>
     <w:semiHidden/>
     <w:unhideWhenUsed/>
   </w:style>
-  <w:style w:type="table" w:customStyle="1" w:styleId="TableNormal0">
+  <w:style w:type="table" w:customStyle="1" w:styleId="TableNormal">
     <w:name w:val="TableNormal"/>
     <w:tblPr>
       <w:tblCellMar>
@@ -11200,10 +11562,10 @@
       </w:tblCellMar>
     </w:tblPr>
   </w:style>
-  <w:style w:type="paragraph" w:styleId="Title">
+  <w:style w:type="paragraph" w:styleId="a3">
     <w:name w:val="Title"/>
-    <w:basedOn w:val="Normal"/>
-    <w:next w:val="Normal"/>
+    <w:basedOn w:val="a"/>
+    <w:next w:val="a"/>
     <w:uiPriority w:val="10"/>
     <w:qFormat/>
     <w:pPr>
@@ -11216,10 +11578,10 @@
       <w:szCs w:val="52"/>
     </w:rPr>
   </w:style>
-  <w:style w:type="paragraph" w:styleId="Subtitle">
+  <w:style w:type="paragraph" w:styleId="a4">
     <w:name w:val="Subtitle"/>
-    <w:basedOn w:val="Normal"/>
-    <w:next w:val="Normal"/>
+    <w:basedOn w:val="a"/>
+    <w:next w:val="a"/>
     <w:uiPriority w:val="11"/>
     <w:qFormat/>
     <w:pPr>
@@ -11233,8 +11595,8 @@
       <w:szCs w:val="30"/>
     </w:rPr>
   </w:style>
-  <w:style w:type="table" w:customStyle="1" w:styleId="a">
-    <w:basedOn w:val="TableNormal0"/>
+  <w:style w:type="table" w:customStyle="1" w:styleId="a5">
+    <w:basedOn w:val="TableNormal"/>
     <w:tblPr>
       <w:tblStyleRowBandSize w:val="1"/>
       <w:tblStyleColBandSize w:val="1"/>
@@ -11247,8 +11609,8 @@
   </w:style>
   <w:style w:type="paragraph" w:styleId="TOC1">
     <w:name w:val="toc 1"/>
-    <w:basedOn w:val="Normal"/>
-    <w:next w:val="Normal"/>
+    <w:basedOn w:val="a"/>
+    <w:next w:val="a"/>
     <w:rsid w:val="00DD3EFC"/>
     <w:pPr>
       <w:tabs>
@@ -11268,8 +11630,8 @@
   </w:style>
   <w:style w:type="paragraph" w:styleId="TOC2">
     <w:name w:val="toc 2"/>
-    <w:basedOn w:val="Normal"/>
-    <w:next w:val="Normal"/>
+    <w:basedOn w:val="a"/>
+    <w:next w:val="a"/>
     <w:rsid w:val="00DD3EFC"/>
     <w:pPr>
       <w:tabs>
@@ -11287,10 +11649,10 @@
       <w:lang w:val="en-US" w:eastAsia="zh-CN"/>
     </w:rPr>
   </w:style>
-  <w:style w:type="character" w:customStyle="1" w:styleId="Heading2Char">
-    <w:name w:val="Heading 2 Char"/>
-    <w:basedOn w:val="DefaultParagraphFont"/>
-    <w:link w:val="Heading2"/>
+  <w:style w:type="character" w:customStyle="1" w:styleId="20">
+    <w:name w:val="标题 2 字符"/>
+    <w:basedOn w:val="a0"/>
+    <w:link w:val="2"/>
     <w:uiPriority w:val="9"/>
     <w:rsid w:val="004C44BC"/>
     <w:rPr>
@@ -11298,15 +11660,78 @@
       <w:szCs w:val="32"/>
     </w:rPr>
   </w:style>
-  <w:style w:type="paragraph" w:styleId="ListParagraph">
+  <w:style w:type="paragraph" w:styleId="a6">
     <w:name w:val="List Paragraph"/>
-    <w:basedOn w:val="Normal"/>
+    <w:basedOn w:val="a"/>
     <w:uiPriority w:val="34"/>
     <w:qFormat/>
     <w:rsid w:val="004C44BC"/>
     <w:pPr>
       <w:ind w:firstLineChars="200" w:firstLine="420"/>
     </w:pPr>
+  </w:style>
+  <w:style w:type="paragraph" w:styleId="a7">
+    <w:name w:val="header"/>
+    <w:basedOn w:val="a"/>
+    <w:link w:val="a8"/>
+    <w:uiPriority w:val="99"/>
+    <w:unhideWhenUsed/>
+    <w:rsid w:val="00EF7AE1"/>
+    <w:pPr>
+      <w:tabs>
+        <w:tab w:val="center" w:pos="4153"/>
+        <w:tab w:val="right" w:pos="8306"/>
+      </w:tabs>
+      <w:snapToGrid w:val="0"/>
+      <w:spacing w:line="240" w:lineRule="auto"/>
+      <w:jc w:val="center"/>
+    </w:pPr>
+    <w:rPr>
+      <w:sz w:val="18"/>
+      <w:szCs w:val="18"/>
+    </w:rPr>
+  </w:style>
+  <w:style w:type="character" w:customStyle="1" w:styleId="a8">
+    <w:name w:val="页眉 字符"/>
+    <w:basedOn w:val="a0"/>
+    <w:link w:val="a7"/>
+    <w:uiPriority w:val="99"/>
+    <w:rsid w:val="00EF7AE1"/>
+    <w:rPr>
+      <w:sz w:val="18"/>
+      <w:szCs w:val="18"/>
+    </w:rPr>
+  </w:style>
+  <w:style w:type="paragraph" w:styleId="a9">
+    <w:name w:val="footer"/>
+    <w:basedOn w:val="a"/>
+    <w:link w:val="aa"/>
+    <w:uiPriority w:val="99"/>
+    <w:unhideWhenUsed/>
+    <w:rsid w:val="00EF7AE1"/>
+    <w:pPr>
+      <w:tabs>
+        <w:tab w:val="center" w:pos="4153"/>
+        <w:tab w:val="right" w:pos="8306"/>
+      </w:tabs>
+      <w:snapToGrid w:val="0"/>
+      <w:spacing w:line="240" w:lineRule="auto"/>
+    </w:pPr>
+    <w:rPr>
+      <w:sz w:val="18"/>
+      <w:szCs w:val="18"/>
+    </w:rPr>
+  </w:style>
+  <w:style w:type="character" w:customStyle="1" w:styleId="aa">
+    <w:name w:val="页脚 字符"/>
+    <w:basedOn w:val="a0"/>
+    <w:link w:val="a9"/>
+    <w:uiPriority w:val="99"/>
+    <w:rsid w:val="00EF7AE1"/>
+    <w:rPr>
+      <w:sz w:val="18"/>
+      <w:szCs w:val="18"/>
+    </w:rPr>
   </w:style>
 </w:styles>
 </file>

</xml_diff>

<commit_message>
Revision history up to date
</commit_message>
<xml_diff>
--- a/Communications SRS.docx
+++ b/Communications SRS.docx
@@ -1386,7 +1386,23 @@
                 <w:sz w:val="20"/>
                 <w:szCs w:val="20"/>
               </w:rPr>
-              <w:t xml:space="preserve"> 3/2/2026</w:t>
+              <w:t xml:space="preserve"> </w:t>
+            </w:r>
+            <w:r>
+              <w:rPr>
+                <w:rFonts w:ascii="Times New Roman" w:eastAsia="Times New Roman" w:hAnsi="Times New Roman" w:cs="Times New Roman"/>
+                <w:sz w:val="20"/>
+                <w:szCs w:val="20"/>
+              </w:rPr>
+              <w:t>0</w:t>
+            </w:r>
+            <w:r>
+              <w:rPr>
+                <w:rFonts w:ascii="Times New Roman" w:eastAsia="Times New Roman" w:hAnsi="Times New Roman" w:cs="Times New Roman"/>
+                <w:sz w:val="20"/>
+                <w:szCs w:val="20"/>
+              </w:rPr>
+              <w:t>3/2/2026</w:t>
             </w:r>
           </w:p>
         </w:tc>
@@ -1533,6 +1549,177 @@
               <w:bottom w:w="0" w:type="dxa"/>
               <w:right w:w="100" w:type="dxa"/>
             </w:tcMar>
+          </w:tcPr>
+          <w:p>
+            <w:pPr>
+              <w:spacing w:before="40" w:after="40"/>
+              <w:ind w:left="-120"/>
+              <w:rPr>
+                <w:rFonts w:ascii="Times New Roman" w:eastAsia="Times New Roman" w:hAnsi="Times New Roman" w:cs="Times New Roman"/>
+                <w:sz w:val="20"/>
+                <w:szCs w:val="20"/>
+              </w:rPr>
+            </w:pPr>
+            <w:r>
+              <w:rPr>
+                <w:rFonts w:ascii="Times New Roman" w:eastAsia="Times New Roman" w:hAnsi="Times New Roman" w:cs="Times New Roman"/>
+                <w:sz w:val="20"/>
+                <w:szCs w:val="20"/>
+              </w:rPr>
+              <w:t xml:space="preserve"> 03/2/2026</w:t>
+            </w:r>
+          </w:p>
+        </w:tc>
+        <w:tc>
+          <w:tcPr>
+            <w:tcW w:w="1245" w:type="dxa"/>
+            <w:tcBorders>
+              <w:top w:val="nil"/>
+              <w:left w:val="single" w:sz="8" w:space="0" w:color="000000"/>
+              <w:bottom w:val="single" w:sz="8" w:space="0" w:color="000000"/>
+              <w:right w:val="nil"/>
+            </w:tcBorders>
+            <w:shd w:val="clear" w:color="auto" w:fill="E5E5E5"/>
+            <w:tcMar>
+              <w:top w:w="0" w:type="dxa"/>
+              <w:left w:w="100" w:type="dxa"/>
+              <w:bottom w:w="0" w:type="dxa"/>
+              <w:right w:w="100" w:type="dxa"/>
+            </w:tcMar>
+          </w:tcPr>
+          <w:p>
+            <w:pPr>
+              <w:spacing w:before="40" w:after="40"/>
+              <w:ind w:left="-120"/>
+              <w:rPr>
+                <w:rFonts w:ascii="Times New Roman" w:eastAsia="Times New Roman" w:hAnsi="Times New Roman" w:cs="Times New Roman"/>
+                <w:sz w:val="20"/>
+                <w:szCs w:val="20"/>
+              </w:rPr>
+            </w:pPr>
+            <w:r>
+              <w:rPr>
+                <w:rFonts w:ascii="Times New Roman" w:eastAsia="Times New Roman" w:hAnsi="Times New Roman" w:cs="Times New Roman"/>
+                <w:sz w:val="20"/>
+                <w:szCs w:val="20"/>
+              </w:rPr>
+              <w:t xml:space="preserve"> 1.7</w:t>
+            </w:r>
+          </w:p>
+        </w:tc>
+        <w:tc>
+          <w:tcPr>
+            <w:tcW w:w="3555" w:type="dxa"/>
+            <w:tcBorders>
+              <w:top w:val="nil"/>
+              <w:left w:val="single" w:sz="8" w:space="0" w:color="000000"/>
+              <w:bottom w:val="single" w:sz="8" w:space="0" w:color="000000"/>
+              <w:right w:val="nil"/>
+            </w:tcBorders>
+            <w:shd w:val="clear" w:color="auto" w:fill="E5E5E5"/>
+            <w:tcMar>
+              <w:top w:w="0" w:type="dxa"/>
+              <w:left w:w="100" w:type="dxa"/>
+              <w:bottom w:w="0" w:type="dxa"/>
+              <w:right w:w="100" w:type="dxa"/>
+            </w:tcMar>
+          </w:tcPr>
+          <w:p>
+            <w:pPr>
+              <w:spacing w:before="40" w:after="40"/>
+              <w:ind w:left="-120"/>
+              <w:rPr>
+                <w:rFonts w:ascii="Times New Roman" w:eastAsia="Times New Roman" w:hAnsi="Times New Roman" w:cs="Times New Roman"/>
+                <w:sz w:val="20"/>
+                <w:szCs w:val="20"/>
+              </w:rPr>
+            </w:pPr>
+            <w:r>
+              <w:rPr>
+                <w:rFonts w:ascii="Times New Roman" w:eastAsia="Times New Roman" w:hAnsi="Times New Roman" w:cs="Times New Roman"/>
+                <w:sz w:val="20"/>
+                <w:szCs w:val="20"/>
+              </w:rPr>
+              <w:t xml:space="preserve"> Added IT module</w:t>
+            </w:r>
+          </w:p>
+        </w:tc>
+        <w:tc>
+          <w:tcPr>
+            <w:tcW w:w="2490" w:type="dxa"/>
+            <w:tcBorders>
+              <w:top w:val="nil"/>
+              <w:left w:val="single" w:sz="8" w:space="0" w:color="000000"/>
+              <w:bottom w:val="single" w:sz="8" w:space="0" w:color="000000"/>
+              <w:right w:val="single" w:sz="8" w:space="0" w:color="000000"/>
+            </w:tcBorders>
+            <w:shd w:val="clear" w:color="auto" w:fill="E5E5E5"/>
+            <w:tcMar>
+              <w:top w:w="0" w:type="dxa"/>
+              <w:left w:w="100" w:type="dxa"/>
+              <w:bottom w:w="0" w:type="dxa"/>
+              <w:right w:w="100" w:type="dxa"/>
+            </w:tcMar>
+          </w:tcPr>
+          <w:p>
+            <w:pPr>
+              <w:spacing w:before="40" w:after="40"/>
+              <w:ind w:left="-120"/>
+              <w:rPr>
+                <w:rFonts w:ascii="Times New Roman" w:eastAsia="Times New Roman" w:hAnsi="Times New Roman" w:cs="Times New Roman"/>
+                <w:sz w:val="20"/>
+                <w:szCs w:val="20"/>
+              </w:rPr>
+            </w:pPr>
+            <w:r>
+              <w:rPr>
+                <w:rFonts w:ascii="Times New Roman" w:eastAsia="Times New Roman" w:hAnsi="Times New Roman" w:cs="Times New Roman"/>
+                <w:sz w:val="20"/>
+                <w:szCs w:val="20"/>
+              </w:rPr>
+              <w:t xml:space="preserve"> </w:t>
+            </w:r>
+            <w:proofErr w:type="spellStart"/>
+            <w:r>
+              <w:rPr>
+                <w:rFonts w:ascii="Times New Roman" w:eastAsia="Times New Roman" w:hAnsi="Times New Roman" w:cs="Times New Roman"/>
+                <w:sz w:val="20"/>
+                <w:szCs w:val="20"/>
+              </w:rPr>
+              <w:t>Mukshar</w:t>
+            </w:r>
+            <w:proofErr w:type="spellEnd"/>
+            <w:r>
+              <w:rPr>
+                <w:rFonts w:ascii="Times New Roman" w:eastAsia="Times New Roman" w:hAnsi="Times New Roman" w:cs="Times New Roman"/>
+                <w:sz w:val="20"/>
+                <w:szCs w:val="20"/>
+              </w:rPr>
+              <w:t xml:space="preserve"> Wah</w:t>
+            </w:r>
+          </w:p>
+        </w:tc>
+      </w:tr>
+      <w:tr>
+        <w:trPr>
+          <w:trHeight w:val="330"/>
+        </w:trPr>
+        <w:tc>
+          <w:tcPr>
+            <w:tcW w:w="1455" w:type="dxa"/>
+            <w:tcBorders>
+              <w:top w:val="nil"/>
+              <w:left w:val="single" w:sz="8" w:space="0" w:color="000000"/>
+              <w:bottom w:val="single" w:sz="8" w:space="0" w:color="000000"/>
+              <w:right w:val="nil"/>
+            </w:tcBorders>
+            <w:shd w:val="clear" w:color="auto" w:fill="E5E5E5"/>
+            <w:tcMar>
+              <w:top w:w="0" w:type="dxa"/>
+              <w:left w:w="100" w:type="dxa"/>
+              <w:bottom w:w="0" w:type="dxa"/>
+              <w:right w:w="100" w:type="dxa"/>
+            </w:tcMar>
             <w:hideMark/>
           </w:tcPr>
           <w:p>
@@ -1596,7 +1783,7 @@
                 <w:sz w:val="20"/>
                 <w:szCs w:val="20"/>
               </w:rPr>
-              <w:t>7</w:t>
+              <w:t>8</w:t>
             </w:r>
           </w:p>
         </w:tc>

</xml_diff>

<commit_message>
Project Phase 1 Deliverables
</commit_message>
<xml_diff>
--- a/Communications SRS.docx
+++ b/Communications SRS.docx
@@ -1256,15 +1256,7 @@
                 <w:sz w:val="20"/>
                 <w:szCs w:val="20"/>
               </w:rPr>
-              <w:t xml:space="preserve"> 1.</w:t>
-            </w:r>
-            <w:r>
-              <w:rPr>
-                <w:rFonts w:ascii="Times New Roman" w:eastAsia="Times New Roman" w:hAnsi="Times New Roman" w:cs="Times New Roman"/>
-                <w:sz w:val="20"/>
-                <w:szCs w:val="20"/>
-              </w:rPr>
-              <w:t>5</w:t>
+              <w:t xml:space="preserve"> 1.5</w:t>
             </w:r>
           </w:p>
         </w:tc>
@@ -1440,15 +1432,7 @@
                 <w:sz w:val="20"/>
                 <w:szCs w:val="20"/>
               </w:rPr>
-              <w:t xml:space="preserve"> 1.</w:t>
-            </w:r>
-            <w:r>
-              <w:rPr>
-                <w:rFonts w:ascii="Times New Roman" w:eastAsia="Times New Roman" w:hAnsi="Times New Roman" w:cs="Times New Roman"/>
-                <w:sz w:val="20"/>
-                <w:szCs w:val="20"/>
-              </w:rPr>
-              <w:t>6</w:t>
+              <w:t xml:space="preserve"> 1.6</w:t>
             </w:r>
           </w:p>
         </w:tc>
@@ -2153,7 +2137,23 @@
                 <w:sz w:val="20"/>
                 <w:szCs w:val="20"/>
               </w:rPr>
-              <w:t xml:space="preserve"> Minor tweaks</w:t>
+              <w:t xml:space="preserve"> </w:t>
+            </w:r>
+            <w:r>
+              <w:rPr>
+                <w:rFonts w:ascii="Times New Roman" w:eastAsia="Times New Roman" w:hAnsi="Times New Roman" w:cs="Times New Roman"/>
+                <w:sz w:val="20"/>
+                <w:szCs w:val="20"/>
+              </w:rPr>
+              <w:t>Finishing</w:t>
+            </w:r>
+            <w:r>
+              <w:rPr>
+                <w:rFonts w:ascii="Times New Roman" w:eastAsia="Times New Roman" w:hAnsi="Times New Roman" w:cs="Times New Roman"/>
+                <w:sz w:val="20"/>
+                <w:szCs w:val="20"/>
+              </w:rPr>
+              <w:t xml:space="preserve"> tweaks</w:t>
             </w:r>
           </w:p>
         </w:tc>
@@ -3738,24 +3738,31 @@
     </w:p>
     <w:p>
       <w:pPr>
-        <w:spacing w:before="80" w:line="240" w:lineRule="auto"/>
+        <w:spacing w:line="360" w:lineRule="auto"/>
         <w:ind w:left="1440"/>
-        <w:jc w:val="both"/>
-        <w:rPr>
-          <w:rFonts w:ascii="Times New Roman" w:eastAsia="Times New Roman" w:hAnsi="Times New Roman" w:cs="Times New Roman"/>
-          <w:color w:val="7030A0"/>
-          <w:sz w:val="20"/>
-          <w:szCs w:val="20"/>
-        </w:rPr>
-      </w:pPr>
-      <w:r>
-        <w:rPr>
-          <w:rFonts w:ascii="Times New Roman" w:eastAsia="Times New Roman" w:hAnsi="Times New Roman" w:cs="Times New Roman"/>
-          <w:color w:val="7030A0"/>
-          <w:sz w:val="20"/>
-          <w:szCs w:val="20"/>
-        </w:rPr>
-        <w:t>Use Case Specification Document</w:t>
+        <w:rPr>
+          <w:rFonts w:ascii="Times New Roman" w:eastAsia="Times New Roman" w:hAnsi="Times New Roman" w:cs="Times New Roman"/>
+          <w:sz w:val="20"/>
+          <w:szCs w:val="20"/>
+        </w:rPr>
+      </w:pPr>
+      <w:bookmarkStart w:id="4" w:name="_4x3tj4kkgp1f" w:colFirst="0" w:colLast="0"/>
+      <w:bookmarkEnd w:id="4"/>
+      <w:r>
+        <w:rPr>
+          <w:rFonts w:ascii="Times New Roman" w:eastAsia="Times New Roman" w:hAnsi="Times New Roman" w:cs="Times New Roman"/>
+          <w:sz w:val="20"/>
+          <w:szCs w:val="20"/>
+        </w:rPr>
+        <w:t xml:space="preserve">Use Case Specification Document </w:t>
+      </w:r>
+      <w:r>
+        <w:rPr>
+          <w:rFonts w:ascii="Times New Roman" w:eastAsia="Times New Roman" w:hAnsi="Times New Roman" w:cs="Times New Roman"/>
+          <w:sz w:val="20"/>
+          <w:szCs w:val="20"/>
+        </w:rPr>
+        <w:t>–</w:t>
       </w:r>
       <w:r>
         <w:rPr>
@@ -3768,77 +3775,67 @@
       <w:r>
         <w:rPr>
           <w:rFonts w:ascii="Times New Roman" w:eastAsia="Times New Roman" w:hAnsi="Times New Roman" w:cs="Times New Roman"/>
-          <w:color w:val="7030A0"/>
-          <w:sz w:val="20"/>
-          <w:szCs w:val="20"/>
-        </w:rPr>
-        <w:t>– Step 2 in assignment description</w:t>
-      </w:r>
-    </w:p>
-    <w:p>
-      <w:pPr>
-        <w:spacing w:before="80" w:line="240" w:lineRule="auto"/>
+          <w:sz w:val="20"/>
+          <w:szCs w:val="20"/>
+        </w:rPr>
+        <w:t>Use Case Specification pdf</w:t>
+      </w:r>
+    </w:p>
+    <w:p>
+      <w:pPr>
+        <w:spacing w:line="360" w:lineRule="auto"/>
         <w:ind w:left="1440"/>
-        <w:jc w:val="both"/>
-        <w:rPr>
-          <w:rFonts w:ascii="Times New Roman" w:eastAsia="Times New Roman" w:hAnsi="Times New Roman" w:cs="Times New Roman"/>
-          <w:color w:val="7030A0"/>
-          <w:sz w:val="20"/>
-          <w:szCs w:val="20"/>
-        </w:rPr>
-      </w:pPr>
-      <w:r>
-        <w:rPr>
-          <w:rFonts w:ascii="Times New Roman" w:eastAsia="Times New Roman" w:hAnsi="Times New Roman" w:cs="Times New Roman"/>
-          <w:color w:val="7030A0"/>
-          <w:sz w:val="20"/>
-          <w:szCs w:val="20"/>
-        </w:rPr>
-        <w:t>UML Use Case Diagrams Document – Step 3 in assignment description</w:t>
-      </w:r>
-    </w:p>
-    <w:p>
-      <w:pPr>
-        <w:spacing w:before="80" w:line="240" w:lineRule="auto"/>
+        <w:rPr>
+          <w:rFonts w:ascii="Times New Roman" w:eastAsia="Times New Roman" w:hAnsi="Times New Roman" w:cs="Times New Roman"/>
+          <w:sz w:val="20"/>
+          <w:szCs w:val="20"/>
+        </w:rPr>
+      </w:pPr>
+      <w:r>
+        <w:rPr>
+          <w:rFonts w:ascii="Times New Roman" w:eastAsia="Times New Roman" w:hAnsi="Times New Roman" w:cs="Times New Roman"/>
+          <w:sz w:val="20"/>
+          <w:szCs w:val="20"/>
+        </w:rPr>
+        <w:t>UML Use Case Diagram Document – Use Case Diagram pdf</w:t>
+      </w:r>
+    </w:p>
+    <w:p>
+      <w:pPr>
+        <w:spacing w:line="360" w:lineRule="auto"/>
         <w:ind w:left="1440"/>
-        <w:jc w:val="both"/>
-        <w:rPr>
-          <w:rFonts w:ascii="Times New Roman" w:eastAsia="Times New Roman" w:hAnsi="Times New Roman" w:cs="Times New Roman"/>
-          <w:color w:val="7030A0"/>
-          <w:sz w:val="20"/>
-          <w:szCs w:val="20"/>
-        </w:rPr>
-      </w:pPr>
-      <w:r>
-        <w:rPr>
-          <w:rFonts w:ascii="Times New Roman" w:eastAsia="Times New Roman" w:hAnsi="Times New Roman" w:cs="Times New Roman"/>
-          <w:color w:val="7030A0"/>
-          <w:sz w:val="20"/>
-          <w:szCs w:val="20"/>
-        </w:rPr>
-        <w:t>Class Diagrams – Step 5 in assignment description</w:t>
-      </w:r>
-    </w:p>
-    <w:p>
-      <w:pPr>
-        <w:spacing w:before="80" w:line="240" w:lineRule="auto"/>
+        <w:rPr>
+          <w:rFonts w:ascii="Times New Roman" w:eastAsia="Times New Roman" w:hAnsi="Times New Roman" w:cs="Times New Roman"/>
+          <w:sz w:val="20"/>
+          <w:szCs w:val="20"/>
+        </w:rPr>
+      </w:pPr>
+      <w:r>
+        <w:rPr>
+          <w:rFonts w:ascii="Times New Roman" w:eastAsia="Times New Roman" w:hAnsi="Times New Roman" w:cs="Times New Roman"/>
+          <w:sz w:val="20"/>
+          <w:szCs w:val="20"/>
+        </w:rPr>
+        <w:t>Class Diagram – Class Diagram pdf</w:t>
+      </w:r>
+    </w:p>
+    <w:p>
+      <w:pPr>
+        <w:spacing w:line="360" w:lineRule="auto"/>
         <w:ind w:left="1440"/>
-        <w:jc w:val="both"/>
-        <w:rPr>
-          <w:rFonts w:ascii="Times New Roman" w:eastAsia="Times New Roman" w:hAnsi="Times New Roman" w:cs="Times New Roman"/>
-          <w:color w:val="7030A0"/>
-          <w:sz w:val="20"/>
-          <w:szCs w:val="20"/>
-        </w:rPr>
-      </w:pPr>
-      <w:r>
-        <w:rPr>
-          <w:rFonts w:ascii="Times New Roman" w:eastAsia="Times New Roman" w:hAnsi="Times New Roman" w:cs="Times New Roman"/>
-          <w:color w:val="7030A0"/>
-          <w:sz w:val="20"/>
-          <w:szCs w:val="20"/>
-        </w:rPr>
-        <w:t>Sequence Diagrams – Step 6 in assignment description</w:t>
+        <w:rPr>
+          <w:rFonts w:ascii="Times New Roman" w:eastAsia="Times New Roman" w:hAnsi="Times New Roman" w:cs="Times New Roman"/>
+          <w:sz w:val="20"/>
+          <w:szCs w:val="20"/>
+        </w:rPr>
+      </w:pPr>
+      <w:r>
+        <w:rPr>
+          <w:rFonts w:ascii="Times New Roman" w:eastAsia="Times New Roman" w:hAnsi="Times New Roman" w:cs="Times New Roman"/>
+          <w:sz w:val="20"/>
+          <w:szCs w:val="20"/>
+        </w:rPr>
+        <w:t>Sequence Diagrams – Login Logout Sequence Diagram &amp; Message Sending Sequence Diagram pdfs</w:t>
       </w:r>
     </w:p>
     <w:p>
@@ -3858,8 +3855,6 @@
           <w:szCs w:val="24"/>
         </w:rPr>
       </w:pPr>
-      <w:bookmarkStart w:id="4" w:name="_4x3tj4kkgp1f" w:colFirst="0" w:colLast="0"/>
-      <w:bookmarkEnd w:id="4"/>
       <w:r>
         <w:rPr>
           <w:rFonts w:ascii="Times New Roman" w:eastAsia="Times New Roman" w:hAnsi="Times New Roman" w:cs="Times New Roman"/>
@@ -4340,7 +4335,31 @@
           <w:sz w:val="20"/>
           <w:szCs w:val="20"/>
         </w:rPr>
-        <w:t>1.User account management</w:t>
+        <w:t>1.</w:t>
+      </w:r>
+      <w:r>
+        <w:rPr>
+          <w:rFonts w:ascii="Times New Roman" w:eastAsia="Times New Roman" w:hAnsi="Times New Roman" w:cs="Times New Roman"/>
+          <w:sz w:val="20"/>
+          <w:szCs w:val="20"/>
+        </w:rPr>
+        <w:t xml:space="preserve"> </w:t>
+      </w:r>
+      <w:r>
+        <w:rPr>
+          <w:rFonts w:ascii="Times New Roman" w:eastAsia="Times New Roman" w:hAnsi="Times New Roman" w:cs="Times New Roman"/>
+          <w:sz w:val="20"/>
+          <w:szCs w:val="20"/>
+        </w:rPr>
+        <w:t xml:space="preserve">User account </w:t>
+      </w:r>
+      <w:r>
+        <w:rPr>
+          <w:rFonts w:ascii="Times New Roman" w:eastAsia="Times New Roman" w:hAnsi="Times New Roman" w:cs="Times New Roman"/>
+          <w:sz w:val="20"/>
+          <w:szCs w:val="20"/>
+        </w:rPr>
+        <w:t>authentication</w:t>
       </w:r>
     </w:p>
     <w:p>
@@ -4359,7 +4378,31 @@
           <w:sz w:val="20"/>
           <w:szCs w:val="20"/>
         </w:rPr>
-        <w:t>2.Real-time text messaging</w:t>
+        <w:t>2.</w:t>
+      </w:r>
+      <w:r>
+        <w:rPr>
+          <w:rFonts w:ascii="Times New Roman" w:eastAsia="Times New Roman" w:hAnsi="Times New Roman" w:cs="Times New Roman"/>
+          <w:sz w:val="20"/>
+          <w:szCs w:val="20"/>
+        </w:rPr>
+        <w:t xml:space="preserve"> </w:t>
+      </w:r>
+      <w:r>
+        <w:rPr>
+          <w:rFonts w:ascii="Times New Roman" w:eastAsia="Times New Roman" w:hAnsi="Times New Roman" w:cs="Times New Roman"/>
+          <w:sz w:val="20"/>
+          <w:szCs w:val="20"/>
+        </w:rPr>
+        <w:t>Real-time text messaging</w:t>
+      </w:r>
+      <w:r>
+        <w:rPr>
+          <w:rFonts w:ascii="Times New Roman" w:eastAsia="Times New Roman" w:hAnsi="Times New Roman" w:cs="Times New Roman"/>
+          <w:sz w:val="20"/>
+          <w:szCs w:val="20"/>
+        </w:rPr>
+        <w:t xml:space="preserve"> (Synchronous &amp; Asynchronous)</w:t>
       </w:r>
     </w:p>
     <w:p>
@@ -4378,7 +4421,15 @@
           <w:sz w:val="20"/>
           <w:szCs w:val="20"/>
         </w:rPr>
-        <w:t>3.group communication</w:t>
+        <w:t>3.</w:t>
+      </w:r>
+      <w:r>
+        <w:rPr>
+          <w:rFonts w:ascii="Times New Roman" w:eastAsia="Times New Roman" w:hAnsi="Times New Roman" w:cs="Times New Roman"/>
+          <w:sz w:val="20"/>
+          <w:szCs w:val="20"/>
+        </w:rPr>
+        <w:t xml:space="preserve"> One on one and group communication</w:t>
       </w:r>
     </w:p>
     <w:p>
@@ -4397,7 +4448,23 @@
           <w:sz w:val="20"/>
           <w:szCs w:val="20"/>
         </w:rPr>
-        <w:t>4.inquire history message</w:t>
+        <w:t>4.</w:t>
+      </w:r>
+      <w:r>
+        <w:rPr>
+          <w:rFonts w:ascii="Times New Roman" w:eastAsia="Times New Roman" w:hAnsi="Times New Roman" w:cs="Times New Roman"/>
+          <w:sz w:val="20"/>
+          <w:szCs w:val="20"/>
+        </w:rPr>
+        <w:t xml:space="preserve"> IT message log viewing</w:t>
+      </w:r>
+      <w:r>
+        <w:rPr>
+          <w:rFonts w:ascii="Times New Roman" w:eastAsia="Times New Roman" w:hAnsi="Times New Roman" w:cs="Times New Roman"/>
+          <w:sz w:val="20"/>
+          <w:szCs w:val="20"/>
+        </w:rPr>
+        <w:t xml:space="preserve"> &amp; exporting</w:t>
       </w:r>
     </w:p>
     <w:p>
@@ -4787,7 +4854,31 @@
           <w:sz w:val="20"/>
           <w:szCs w:val="20"/>
         </w:rPr>
-        <w:t>The Login Module (</w:t>
+        <w:t xml:space="preserve">The </w:t>
+      </w:r>
+      <w:r>
+        <w:rPr>
+          <w:rFonts w:ascii="Times New Roman" w:hAnsi="Times New Roman" w:cs="Times New Roman"/>
+          <w:sz w:val="20"/>
+          <w:szCs w:val="20"/>
+        </w:rPr>
+        <w:t xml:space="preserve">User </w:t>
+      </w:r>
+      <w:r>
+        <w:rPr>
+          <w:rFonts w:ascii="Times New Roman" w:hAnsi="Times New Roman" w:cs="Times New Roman"/>
+          <w:sz w:val="20"/>
+          <w:szCs w:val="20"/>
+        </w:rPr>
+        <w:t>Login Module (</w:t>
+      </w:r>
+      <w:r>
+        <w:rPr>
+          <w:rFonts w:ascii="Times New Roman" w:hAnsi="Times New Roman" w:cs="Times New Roman"/>
+          <w:sz w:val="20"/>
+          <w:szCs w:val="20"/>
+        </w:rPr>
+        <w:t>U</w:t>
       </w:r>
       <w:r>
         <w:rPr>
@@ -4803,7 +4894,23 @@
           <w:sz w:val="20"/>
           <w:szCs w:val="20"/>
         </w:rPr>
-        <w:t>M) contains a login menu to allow users to log into the communications app. This menu is displayed upon loading the client</w:t>
+        <w:t xml:space="preserve">M) contains a login menu to allow users to log into the communications </w:t>
+      </w:r>
+      <w:r>
+        <w:rPr>
+          <w:rFonts w:ascii="Times New Roman" w:hAnsi="Times New Roman" w:cs="Times New Roman"/>
+          <w:sz w:val="20"/>
+          <w:szCs w:val="20"/>
+        </w:rPr>
+        <w:t>system</w:t>
+      </w:r>
+      <w:r>
+        <w:rPr>
+          <w:rFonts w:ascii="Times New Roman" w:hAnsi="Times New Roman" w:cs="Times New Roman"/>
+          <w:sz w:val="20"/>
+          <w:szCs w:val="20"/>
+        </w:rPr>
+        <w:t>. This menu is displayed upon loading the client</w:t>
       </w:r>
     </w:p>
     <w:p>
@@ -4845,7 +4952,23 @@
           <w:sz w:val="20"/>
           <w:szCs w:val="20"/>
         </w:rPr>
-        <w:t>After a user presses login, the client will send the entered username and password to the server to be authenticated</w:t>
+        <w:t xml:space="preserve">After a user presses login, the client will send the entered username and password to the </w:t>
+      </w:r>
+      <w:r>
+        <w:rPr>
+          <w:rFonts w:ascii="Times New Roman" w:hAnsi="Times New Roman" w:cs="Times New Roman"/>
+          <w:sz w:val="20"/>
+          <w:szCs w:val="20"/>
+        </w:rPr>
+        <w:t>CSM</w:t>
+      </w:r>
+      <w:r>
+        <w:rPr>
+          <w:rFonts w:ascii="Times New Roman" w:hAnsi="Times New Roman" w:cs="Times New Roman"/>
+          <w:sz w:val="20"/>
+          <w:szCs w:val="20"/>
+        </w:rPr>
+        <w:t xml:space="preserve"> to be authenticated</w:t>
       </w:r>
     </w:p>
     <w:p>
@@ -5098,7 +5221,23 @@
           <w:sz w:val="20"/>
           <w:szCs w:val="20"/>
         </w:rPr>
-        <w:t>Each chat in this list indicates if it contains unread messages</w:t>
+        <w:t xml:space="preserve">Each chat in </w:t>
+      </w:r>
+      <w:r>
+        <w:rPr>
+          <w:rFonts w:ascii="Times New Roman" w:hAnsi="Times New Roman" w:cs="Times New Roman"/>
+          <w:sz w:val="20"/>
+          <w:szCs w:val="20"/>
+        </w:rPr>
+        <w:t>the chat</w:t>
+      </w:r>
+      <w:r>
+        <w:rPr>
+          <w:rFonts w:ascii="Times New Roman" w:hAnsi="Times New Roman" w:cs="Times New Roman"/>
+          <w:sz w:val="20"/>
+          <w:szCs w:val="20"/>
+        </w:rPr>
+        <w:t xml:space="preserve"> list indicates if it contains unread messages</w:t>
       </w:r>
     </w:p>
     <w:p>
@@ -5435,7 +5574,23 @@
           <w:sz w:val="20"/>
           <w:szCs w:val="20"/>
         </w:rPr>
-        <w:t>Messages sent while the user was offline are indicated, and the client signals to the server that the user has seen these messages</w:t>
+        <w:t>Chats containing messages</w:t>
+      </w:r>
+      <w:r>
+        <w:rPr>
+          <w:rFonts w:ascii="Times New Roman" w:hAnsi="Times New Roman" w:cs="Times New Roman"/>
+          <w:sz w:val="20"/>
+          <w:szCs w:val="20"/>
+        </w:rPr>
+        <w:t xml:space="preserve"> sent while the user was offline are indicated</w:t>
+      </w:r>
+      <w:r>
+        <w:rPr>
+          <w:rFonts w:ascii="Times New Roman" w:hAnsi="Times New Roman" w:cs="Times New Roman"/>
+          <w:sz w:val="20"/>
+          <w:szCs w:val="20"/>
+        </w:rPr>
+        <w:t xml:space="preserve"> as unread</w:t>
       </w:r>
     </w:p>
     <w:p>
@@ -5456,7 +5611,25 @@
           <w:sz w:val="20"/>
           <w:szCs w:val="20"/>
         </w:rPr>
-        <w:t>Whenever a new message is sent from the server, this view is updated, displaying the new message at the forefront</w:t>
+        <w:t xml:space="preserve">When the user’s client displays an unread </w:t>
+      </w:r>
+      <w:proofErr w:type="gramStart"/>
+      <w:r>
+        <w:rPr>
+          <w:rFonts w:ascii="Times New Roman" w:hAnsi="Times New Roman" w:cs="Times New Roman"/>
+          <w:sz w:val="20"/>
+          <w:szCs w:val="20"/>
+        </w:rPr>
+        <w:t>chat</w:t>
+      </w:r>
+      <w:proofErr w:type="gramEnd"/>
+      <w:r>
+        <w:rPr>
+          <w:rFonts w:ascii="Times New Roman" w:hAnsi="Times New Roman" w:cs="Times New Roman"/>
+          <w:sz w:val="20"/>
+          <w:szCs w:val="20"/>
+        </w:rPr>
+        <w:t xml:space="preserve"> it is no longer indicated as unread </w:t>
       </w:r>
     </w:p>
     <w:p>
@@ -5477,8 +5650,7 @@
           <w:sz w:val="20"/>
           <w:szCs w:val="20"/>
         </w:rPr>
-        <w:lastRenderedPageBreak/>
-        <w:t>The chat menu contains a message box allowing the user to write a message, and a button to send it.</w:t>
+        <w:t>Whenever a new message is sent from the server, this view is updated, displaying the new message at the forefront</w:t>
       </w:r>
     </w:p>
     <w:p>
@@ -5499,31 +5671,8 @@
           <w:sz w:val="20"/>
           <w:szCs w:val="20"/>
         </w:rPr>
-        <w:t xml:space="preserve">When a message is sent, it is sent to the server to update the client of </w:t>
-      </w:r>
-      <w:r>
-        <w:rPr>
-          <w:rFonts w:ascii="Times New Roman" w:hAnsi="Times New Roman" w:cs="Times New Roman"/>
-          <w:sz w:val="20"/>
-          <w:szCs w:val="20"/>
-        </w:rPr>
-        <w:t xml:space="preserve">online </w:t>
-      </w:r>
-      <w:r>
-        <w:rPr>
-          <w:rFonts w:ascii="Times New Roman" w:hAnsi="Times New Roman" w:cs="Times New Roman"/>
-          <w:sz w:val="20"/>
-          <w:szCs w:val="20"/>
-        </w:rPr>
-        <w:t xml:space="preserve">users </w:t>
-      </w:r>
-      <w:r>
-        <w:rPr>
-          <w:rFonts w:ascii="Times New Roman" w:hAnsi="Times New Roman" w:cs="Times New Roman"/>
-          <w:sz w:val="20"/>
-          <w:szCs w:val="20"/>
-        </w:rPr>
-        <w:t>involved in the chat</w:t>
+        <w:lastRenderedPageBreak/>
+        <w:t>The chat menu contains a message box allowing the user to write a message, and a button to send it.</w:t>
       </w:r>
     </w:p>
     <w:p>
@@ -5544,7 +5693,31 @@
           <w:sz w:val="20"/>
           <w:szCs w:val="20"/>
         </w:rPr>
-        <w:t>When a message is sent, the date and time stamp at that moment is sent to the server ensure messages are displayed in order</w:t>
+        <w:t xml:space="preserve">When a message is sent, it is sent to the server to update the client of </w:t>
+      </w:r>
+      <w:r>
+        <w:rPr>
+          <w:rFonts w:ascii="Times New Roman" w:hAnsi="Times New Roman" w:cs="Times New Roman"/>
+          <w:sz w:val="20"/>
+          <w:szCs w:val="20"/>
+        </w:rPr>
+        <w:t xml:space="preserve">online </w:t>
+      </w:r>
+      <w:r>
+        <w:rPr>
+          <w:rFonts w:ascii="Times New Roman" w:hAnsi="Times New Roman" w:cs="Times New Roman"/>
+          <w:sz w:val="20"/>
+          <w:szCs w:val="20"/>
+        </w:rPr>
+        <w:t xml:space="preserve">users </w:t>
+      </w:r>
+      <w:r>
+        <w:rPr>
+          <w:rFonts w:ascii="Times New Roman" w:hAnsi="Times New Roman" w:cs="Times New Roman"/>
+          <w:sz w:val="20"/>
+          <w:szCs w:val="20"/>
+        </w:rPr>
+        <w:t>involved in the chat</w:t>
       </w:r>
     </w:p>
     <w:p>
@@ -5565,7 +5738,7 @@
           <w:sz w:val="20"/>
           <w:szCs w:val="20"/>
         </w:rPr>
-        <w:t>The chat menu displays all users involved with the chat, also indicating if this is a group chat or private chat</w:t>
+        <w:t>When a message is sent, the date and time stamp at that moment is sent to the server ensure messages are displayed in order</w:t>
       </w:r>
     </w:p>
     <w:p>
@@ -5586,7 +5759,7 @@
           <w:sz w:val="20"/>
           <w:szCs w:val="20"/>
         </w:rPr>
-        <w:t>The group chat creator’s view of the group chat displays an invite, kick, and delete group chat button</w:t>
+        <w:t>The chat menu displays all users involved with the chat, also indicating if this is a group chat or private chat</w:t>
       </w:r>
     </w:p>
     <w:p>
@@ -5607,31 +5780,7 @@
           <w:sz w:val="20"/>
           <w:szCs w:val="20"/>
         </w:rPr>
-        <w:t>After pressing the invite button, t</w:t>
-      </w:r>
-      <w:r>
-        <w:rPr>
-          <w:rFonts w:ascii="Times New Roman" w:hAnsi="Times New Roman" w:cs="Times New Roman"/>
-          <w:sz w:val="20"/>
-          <w:szCs w:val="20"/>
-        </w:rPr>
-        <w:t xml:space="preserve">he </w:t>
-      </w:r>
-      <w:r>
-        <w:rPr>
-          <w:rFonts w:ascii="Times New Roman" w:hAnsi="Times New Roman" w:cs="Times New Roman"/>
-          <w:sz w:val="20"/>
-          <w:szCs w:val="20"/>
-        </w:rPr>
-        <w:t>group chat creator</w:t>
-      </w:r>
-      <w:r>
-        <w:rPr>
-          <w:rFonts w:ascii="Times New Roman" w:hAnsi="Times New Roman" w:cs="Times New Roman"/>
-          <w:sz w:val="20"/>
-          <w:szCs w:val="20"/>
-        </w:rPr>
-        <w:t xml:space="preserve"> can enter in usernames here to invite users to the chat.</w:t>
+        <w:t>The group chat creator’s view of the group chat displays an invite, kick, and delete group chat button</w:t>
       </w:r>
     </w:p>
     <w:p>
@@ -5652,7 +5801,31 @@
           <w:sz w:val="20"/>
           <w:szCs w:val="20"/>
         </w:rPr>
-        <w:t>After pressing the kick button, the group chat creator is prompted to select the user to kick</w:t>
+        <w:t>After pressing the invite button, t</w:t>
+      </w:r>
+      <w:r>
+        <w:rPr>
+          <w:rFonts w:ascii="Times New Roman" w:hAnsi="Times New Roman" w:cs="Times New Roman"/>
+          <w:sz w:val="20"/>
+          <w:szCs w:val="20"/>
+        </w:rPr>
+        <w:t xml:space="preserve">he </w:t>
+      </w:r>
+      <w:r>
+        <w:rPr>
+          <w:rFonts w:ascii="Times New Roman" w:hAnsi="Times New Roman" w:cs="Times New Roman"/>
+          <w:sz w:val="20"/>
+          <w:szCs w:val="20"/>
+        </w:rPr>
+        <w:t>group chat creator</w:t>
+      </w:r>
+      <w:r>
+        <w:rPr>
+          <w:rFonts w:ascii="Times New Roman" w:hAnsi="Times New Roman" w:cs="Times New Roman"/>
+          <w:sz w:val="20"/>
+          <w:szCs w:val="20"/>
+        </w:rPr>
+        <w:t xml:space="preserve"> can enter in usernames here to invite users to the chat.</w:t>
       </w:r>
     </w:p>
     <w:p>
@@ -5673,7 +5846,7 @@
           <w:sz w:val="20"/>
           <w:szCs w:val="20"/>
         </w:rPr>
-        <w:t>After pressing the delete group chat button, the group chat creator is prompted to confirm the action, and the group chat is deleted</w:t>
+        <w:t>After pressing the kick button, the group chat creator is prompted to select the user to kick</w:t>
       </w:r>
     </w:p>
     <w:p>
@@ -5694,25 +5867,28 @@
           <w:sz w:val="20"/>
           <w:szCs w:val="20"/>
         </w:rPr>
-        <w:t xml:space="preserve">A deleted group chat </w:t>
-      </w:r>
-      <w:proofErr w:type="gramStart"/>
-      <w:r>
-        <w:rPr>
-          <w:rFonts w:ascii="Times New Roman" w:hAnsi="Times New Roman" w:cs="Times New Roman"/>
-          <w:sz w:val="20"/>
-          <w:szCs w:val="20"/>
-        </w:rPr>
-        <w:t>is still has</w:t>
-      </w:r>
-      <w:proofErr w:type="gramEnd"/>
-      <w:r>
-        <w:rPr>
-          <w:rFonts w:ascii="Times New Roman" w:hAnsi="Times New Roman" w:cs="Times New Roman"/>
-          <w:sz w:val="20"/>
-          <w:szCs w:val="20"/>
-        </w:rPr>
-        <w:t xml:space="preserve"> its messages logged, but must not be displayed to the related users</w:t>
+        <w:t>After pressing the delete group chat button, the group chat creator is prompted to confirm the action, and the group chat is deleted</w:t>
+      </w:r>
+    </w:p>
+    <w:p>
+      <w:pPr>
+        <w:numPr>
+          <w:ilvl w:val="2"/>
+          <w:numId w:val="1"/>
+        </w:numPr>
+        <w:rPr>
+          <w:rFonts w:ascii="Times New Roman" w:hAnsi="Times New Roman" w:cs="Times New Roman"/>
+          <w:sz w:val="20"/>
+          <w:szCs w:val="20"/>
+        </w:rPr>
+      </w:pPr>
+      <w:r>
+        <w:rPr>
+          <w:rFonts w:ascii="Times New Roman" w:hAnsi="Times New Roman" w:cs="Times New Roman"/>
+          <w:sz w:val="20"/>
+          <w:szCs w:val="20"/>
+        </w:rPr>
+        <w:t>A deleted group chat still has its messages logged, but must not be displayed to the related users</w:t>
       </w:r>
     </w:p>
     <w:p>
@@ -5764,7 +5940,34 @@
           <w:sz w:val="20"/>
           <w:szCs w:val="20"/>
         </w:rPr>
-        <w:t>The IT Module supports all features available in the Client Module (CM).</w:t>
+        <w:t xml:space="preserve">The IT Module </w:t>
+      </w:r>
+      <w:r>
+        <w:rPr>
+          <w:rFonts w:ascii="Times New Roman" w:hAnsi="Times New Roman" w:cs="Times New Roman"/>
+          <w:color w:val="000000"/>
+          <w:sz w:val="20"/>
+          <w:szCs w:val="20"/>
+        </w:rPr>
+        <w:t xml:space="preserve">(IM) </w:t>
+      </w:r>
+      <w:r>
+        <w:rPr>
+          <w:rFonts w:ascii="Times New Roman" w:hAnsi="Times New Roman" w:cs="Times New Roman"/>
+          <w:color w:val="000000"/>
+          <w:sz w:val="20"/>
+          <w:szCs w:val="20"/>
+        </w:rPr>
+        <w:t xml:space="preserve">supports all features available in the </w:t>
+      </w:r>
+      <w:r>
+        <w:rPr>
+          <w:rFonts w:ascii="Times New Roman" w:hAnsi="Times New Roman" w:cs="Times New Roman"/>
+          <w:color w:val="000000"/>
+          <w:sz w:val="20"/>
+          <w:szCs w:val="20"/>
+        </w:rPr>
+        <w:t>CM</w:t>
       </w:r>
     </w:p>
     <w:p>
@@ -5785,7 +5988,87 @@
           <w:sz w:val="20"/>
           <w:szCs w:val="20"/>
         </w:rPr>
-        <w:t>The IT module provided an Audit view that allows the IT user to review other users’ conversation in read-only mode</w:t>
+        <w:t xml:space="preserve">The </w:t>
+      </w:r>
+      <w:r>
+        <w:rPr>
+          <w:rFonts w:ascii="Times New Roman" w:hAnsi="Times New Roman" w:cs="Times New Roman"/>
+          <w:sz w:val="20"/>
+          <w:szCs w:val="20"/>
+        </w:rPr>
+        <w:t xml:space="preserve">IM </w:t>
+      </w:r>
+      <w:r>
+        <w:rPr>
+          <w:rFonts w:ascii="Times New Roman" w:hAnsi="Times New Roman" w:cs="Times New Roman"/>
+          <w:sz w:val="20"/>
+          <w:szCs w:val="20"/>
+        </w:rPr>
+        <w:t>provide</w:t>
+      </w:r>
+      <w:r>
+        <w:rPr>
+          <w:rFonts w:ascii="Times New Roman" w:hAnsi="Times New Roman" w:cs="Times New Roman"/>
+          <w:sz w:val="20"/>
+          <w:szCs w:val="20"/>
+        </w:rPr>
+        <w:t>s the</w:t>
+      </w:r>
+      <w:r>
+        <w:rPr>
+          <w:rFonts w:ascii="Times New Roman" w:hAnsi="Times New Roman" w:cs="Times New Roman"/>
+          <w:sz w:val="20"/>
+          <w:szCs w:val="20"/>
+        </w:rPr>
+        <w:t xml:space="preserve"> Audit </w:t>
+      </w:r>
+      <w:r>
+        <w:rPr>
+          <w:rFonts w:ascii="Times New Roman" w:hAnsi="Times New Roman" w:cs="Times New Roman"/>
+          <w:sz w:val="20"/>
+          <w:szCs w:val="20"/>
+        </w:rPr>
+        <w:t>menu</w:t>
+      </w:r>
+      <w:r>
+        <w:rPr>
+          <w:rFonts w:ascii="Times New Roman" w:hAnsi="Times New Roman" w:cs="Times New Roman"/>
+          <w:sz w:val="20"/>
+          <w:szCs w:val="20"/>
+        </w:rPr>
+        <w:t xml:space="preserve"> </w:t>
+      </w:r>
+      <w:r>
+        <w:rPr>
+          <w:rFonts w:ascii="Times New Roman" w:hAnsi="Times New Roman" w:cs="Times New Roman"/>
+          <w:sz w:val="20"/>
+          <w:szCs w:val="20"/>
+        </w:rPr>
+        <w:t>which</w:t>
+      </w:r>
+      <w:r>
+        <w:rPr>
+          <w:rFonts w:ascii="Times New Roman" w:hAnsi="Times New Roman" w:cs="Times New Roman"/>
+          <w:sz w:val="20"/>
+          <w:szCs w:val="20"/>
+        </w:rPr>
+        <w:t xml:space="preserve"> allows the IT user to review other users’ conversation</w:t>
+      </w:r>
+      <w:r>
+        <w:rPr>
+          <w:rFonts w:ascii="Times New Roman" w:hAnsi="Times New Roman" w:cs="Times New Roman"/>
+          <w:sz w:val="20"/>
+          <w:szCs w:val="20"/>
+        </w:rPr>
+        <w:t>s</w:t>
+      </w:r>
+      <w:r>
+        <w:rPr>
+          <w:rFonts w:ascii="Times New Roman" w:hAnsi="Times New Roman" w:cs="Times New Roman"/>
+          <w:sz w:val="20"/>
+          <w:szCs w:val="20"/>
+        </w:rPr>
+        <w:t xml:space="preserve"> in read-only mode</w:t>
       </w:r>
     </w:p>
     <w:p>
@@ -6229,7 +6512,7 @@
           <w:sz w:val="20"/>
           <w:szCs w:val="20"/>
         </w:rPr>
-        <w:t xml:space="preserve"> support multiple LM’s, CM’s, and IM’s</w:t>
+        <w:t xml:space="preserve"> support multiple LMs, CMs, and IMs</w:t>
       </w:r>
     </w:p>
     <w:p>
@@ -6547,7 +6830,27 @@
           <w:szCs w:val="20"/>
           <w:lang w:val="en-US"/>
         </w:rPr>
-        <w:t xml:space="preserve"> user interface for the Client Module to support login, chat selection, message viewing, and message sending.</w:t>
+        <w:t xml:space="preserve"> user interface for the </w:t>
+      </w:r>
+      <w:r>
+        <w:rPr>
+          <w:rFonts w:ascii="Times New Roman" w:eastAsia="Times New Roman" w:hAnsi="Times New Roman" w:cs="Times New Roman"/>
+          <w:color w:val="000000" w:themeColor="text1"/>
+          <w:sz w:val="20"/>
+          <w:szCs w:val="20"/>
+          <w:lang w:val="en-US"/>
+        </w:rPr>
+        <w:t>CM, ULM, and IM</w:t>
+      </w:r>
+      <w:r>
+        <w:rPr>
+          <w:rFonts w:ascii="Times New Roman" w:eastAsia="Times New Roman" w:hAnsi="Times New Roman" w:cs="Times New Roman"/>
+          <w:color w:val="000000" w:themeColor="text1"/>
+          <w:sz w:val="20"/>
+          <w:szCs w:val="20"/>
+          <w:lang w:val="en-US"/>
+        </w:rPr>
+        <w:t xml:space="preserve"> to support login, chat selection, message viewing, and message sending.</w:t>
       </w:r>
     </w:p>
     <w:p>
@@ -6877,7 +7180,27 @@
           <w:szCs w:val="20"/>
           <w:lang w:val="en-US"/>
         </w:rPr>
-        <w:t xml:space="preserve">The Communication Service Module shall store message history in a persistent document/file format (no database). </w:t>
+        <w:t xml:space="preserve">The </w:t>
+      </w:r>
+      <w:r>
+        <w:rPr>
+          <w:rFonts w:ascii="Times New Roman" w:eastAsia="Times New Roman" w:hAnsi="Times New Roman" w:cs="Times New Roman"/>
+          <w:color w:val="000000" w:themeColor="text1"/>
+          <w:sz w:val="20"/>
+          <w:szCs w:val="20"/>
+          <w:lang w:val="en-US"/>
+        </w:rPr>
+        <w:t>CSM</w:t>
+      </w:r>
+      <w:r>
+        <w:rPr>
+          <w:rFonts w:ascii="Times New Roman" w:eastAsia="Times New Roman" w:hAnsi="Times New Roman" w:cs="Times New Roman"/>
+          <w:color w:val="000000" w:themeColor="text1"/>
+          <w:sz w:val="20"/>
+          <w:szCs w:val="20"/>
+          <w:lang w:val="en-US"/>
+        </w:rPr>
+        <w:t xml:space="preserve"> shall store message history in a persistent document/file format (no database). </w:t>
       </w:r>
     </w:p>
     <w:p>
@@ -7019,7 +7342,15 @@
           <w:sz w:val="20"/>
           <w:szCs w:val="20"/>
         </w:rPr>
-        <w:t>The communication</w:t>
+        <w:t xml:space="preserve">The </w:t>
+      </w:r>
+      <w:r>
+        <w:rPr>
+          <w:rFonts w:ascii="Times New Roman" w:hAnsi="Times New Roman" w:cs="Times New Roman"/>
+          <w:sz w:val="20"/>
+          <w:szCs w:val="20"/>
+        </w:rPr>
+        <w:t>CSM</w:t>
       </w:r>
       <w:r>
         <w:rPr>
@@ -7028,16 +7359,16 @@
           <w:szCs w:val="20"/>
           <w:lang w:eastAsia="zh-CN"/>
         </w:rPr>
-        <w:t xml:space="preserve"> </w:t>
-      </w:r>
-      <w:r>
-        <w:rPr>
-          <w:rFonts w:ascii="Times New Roman" w:hAnsi="Times New Roman" w:cs="Times New Roman"/>
-          <w:sz w:val="20"/>
-          <w:szCs w:val="20"/>
-          <w:lang w:eastAsia="zh-CN"/>
-        </w:rPr>
-        <w:t>server module</w:t>
+        <w:t xml:space="preserve"> shall provide internal service interfaces for th</w:t>
+      </w:r>
+      <w:r>
+        <w:rPr>
+          <w:rFonts w:ascii="Times New Roman" w:hAnsi="Times New Roman" w:cs="Times New Roman"/>
+          <w:sz w:val="20"/>
+          <w:szCs w:val="20"/>
+          <w:lang w:eastAsia="zh-CN"/>
+        </w:rPr>
+        <w:t>e ULM</w:t>
       </w:r>
       <w:r>
         <w:rPr>
@@ -7046,7 +7377,43 @@
           <w:szCs w:val="20"/>
           <w:lang w:eastAsia="zh-CN"/>
         </w:rPr>
-        <w:t xml:space="preserve"> shall provide internal service interfaces for the login module, client module and IT module to request </w:t>
+        <w:t xml:space="preserve">, </w:t>
+      </w:r>
+      <w:r>
+        <w:rPr>
+          <w:rFonts w:ascii="Times New Roman" w:hAnsi="Times New Roman" w:cs="Times New Roman"/>
+          <w:sz w:val="20"/>
+          <w:szCs w:val="20"/>
+          <w:lang w:eastAsia="zh-CN"/>
+        </w:rPr>
+        <w:t>CM</w:t>
+      </w:r>
+      <w:r>
+        <w:rPr>
+          <w:rFonts w:ascii="Times New Roman" w:hAnsi="Times New Roman" w:cs="Times New Roman" w:hint="eastAsia"/>
+          <w:sz w:val="20"/>
+          <w:szCs w:val="20"/>
+          <w:lang w:eastAsia="zh-CN"/>
+        </w:rPr>
+        <w:t xml:space="preserve"> and </w:t>
+      </w:r>
+      <w:r>
+        <w:rPr>
+          <w:rFonts w:ascii="Times New Roman" w:hAnsi="Times New Roman" w:cs="Times New Roman"/>
+          <w:sz w:val="20"/>
+          <w:szCs w:val="20"/>
+          <w:lang w:eastAsia="zh-CN"/>
+        </w:rPr>
+        <w:t>IM</w:t>
+      </w:r>
+      <w:r>
+        <w:rPr>
+          <w:rFonts w:ascii="Times New Roman" w:hAnsi="Times New Roman" w:cs="Times New Roman" w:hint="eastAsia"/>
+          <w:sz w:val="20"/>
+          <w:szCs w:val="20"/>
+          <w:lang w:eastAsia="zh-CN"/>
+        </w:rPr>
+        <w:t xml:space="preserve"> to request </w:t>
       </w:r>
       <w:r>
         <w:rPr>
@@ -7064,16 +7431,16 @@
           <w:szCs w:val="20"/>
           <w:lang w:eastAsia="zh-CN"/>
         </w:rPr>
-        <w:t xml:space="preserve">, messaging and </w:t>
-      </w:r>
-      <w:r>
-        <w:rPr>
-          <w:rFonts w:ascii="Times New Roman" w:hAnsi="Times New Roman" w:cs="Times New Roman"/>
-          <w:sz w:val="20"/>
-          <w:szCs w:val="20"/>
-          <w:lang w:eastAsia="zh-CN"/>
-        </w:rPr>
-        <w:t>IT</w:t>
+        <w:t>, messaging</w:t>
+      </w:r>
+      <w:r>
+        <w:rPr>
+          <w:rFonts w:ascii="Times New Roman" w:hAnsi="Times New Roman" w:cs="Times New Roman"/>
+          <w:sz w:val="20"/>
+          <w:szCs w:val="20"/>
+          <w:lang w:eastAsia="zh-CN"/>
+        </w:rPr>
+        <w:t>,</w:t>
       </w:r>
       <w:r>
         <w:rPr>
@@ -7082,7 +7449,34 @@
           <w:szCs w:val="20"/>
           <w:lang w:eastAsia="zh-CN"/>
         </w:rPr>
-        <w:t xml:space="preserve"> access. </w:t>
+        <w:t xml:space="preserve"> and </w:t>
+      </w:r>
+      <w:r>
+        <w:rPr>
+          <w:rFonts w:ascii="Times New Roman" w:hAnsi="Times New Roman" w:cs="Times New Roman"/>
+          <w:sz w:val="20"/>
+          <w:szCs w:val="20"/>
+          <w:lang w:eastAsia="zh-CN"/>
+        </w:rPr>
+        <w:t>I</w:t>
+      </w:r>
+      <w:r>
+        <w:rPr>
+          <w:rFonts w:ascii="Times New Roman" w:hAnsi="Times New Roman" w:cs="Times New Roman"/>
+          <w:sz w:val="20"/>
+          <w:szCs w:val="20"/>
+          <w:lang w:eastAsia="zh-CN"/>
+        </w:rPr>
+        <w:t>T Auditing</w:t>
+      </w:r>
+      <w:r>
+        <w:rPr>
+          <w:rFonts w:ascii="Times New Roman" w:hAnsi="Times New Roman" w:cs="Times New Roman" w:hint="eastAsia"/>
+          <w:sz w:val="20"/>
+          <w:szCs w:val="20"/>
+          <w:lang w:eastAsia="zh-CN"/>
+        </w:rPr>
+        <w:t xml:space="preserve">. </w:t>
       </w:r>
     </w:p>
     <w:p>
@@ -7116,7 +7510,25 @@
           <w:szCs w:val="20"/>
           <w:lang w:eastAsia="zh-CN"/>
         </w:rPr>
-        <w:t>he login module shall send authentication requests containing username and password to the communication server module.</w:t>
+        <w:t xml:space="preserve">he </w:t>
+      </w:r>
+      <w:r>
+        <w:rPr>
+          <w:rFonts w:ascii="Times New Roman" w:hAnsi="Times New Roman" w:cs="Times New Roman"/>
+          <w:sz w:val="20"/>
+          <w:szCs w:val="20"/>
+          <w:lang w:eastAsia="zh-CN"/>
+        </w:rPr>
+        <w:t xml:space="preserve">ULM </w:t>
+      </w:r>
+      <w:r>
+        <w:rPr>
+          <w:rFonts w:ascii="Times New Roman" w:hAnsi="Times New Roman" w:cs="Times New Roman" w:hint="eastAsia"/>
+          <w:sz w:val="20"/>
+          <w:szCs w:val="20"/>
+          <w:lang w:eastAsia="zh-CN"/>
+        </w:rPr>
+        <w:t>shall send authentication requests containing username and password to the communication server module.</w:t>
       </w:r>
     </w:p>
     <w:p>
@@ -7149,7 +7561,25 @@
           <w:szCs w:val="20"/>
           <w:lang w:eastAsia="zh-CN"/>
         </w:rPr>
-        <w:t xml:space="preserve">he communication server module shall validate authentication requests and return authentication </w:t>
+        <w:t xml:space="preserve">he </w:t>
+      </w:r>
+      <w:r>
+        <w:rPr>
+          <w:rFonts w:ascii="Times New Roman" w:hAnsi="Times New Roman" w:cs="Times New Roman"/>
+          <w:sz w:val="20"/>
+          <w:szCs w:val="20"/>
+          <w:lang w:eastAsia="zh-CN"/>
+        </w:rPr>
+        <w:t>CSM</w:t>
+      </w:r>
+      <w:r>
+        <w:rPr>
+          <w:rFonts w:ascii="Times New Roman" w:hAnsi="Times New Roman" w:cs="Times New Roman" w:hint="eastAsia"/>
+          <w:sz w:val="20"/>
+          <w:szCs w:val="20"/>
+          <w:lang w:eastAsia="zh-CN"/>
+        </w:rPr>
+        <w:t xml:space="preserve"> shall validate authentication requests and return authentication </w:t>
       </w:r>
       <w:r>
         <w:rPr>
@@ -7200,7 +7630,25 @@
           <w:szCs w:val="20"/>
           <w:lang w:eastAsia="zh-CN"/>
         </w:rPr>
-        <w:t>ith successful authentication the communication server module shall return the authenticated user role and session information to the requesting module.</w:t>
+        <w:t xml:space="preserve">ith successful authentication the </w:t>
+      </w:r>
+      <w:r>
+        <w:rPr>
+          <w:rFonts w:ascii="Times New Roman" w:hAnsi="Times New Roman" w:cs="Times New Roman"/>
+          <w:sz w:val="20"/>
+          <w:szCs w:val="20"/>
+          <w:lang w:eastAsia="zh-CN"/>
+        </w:rPr>
+        <w:t>CSM</w:t>
+      </w:r>
+      <w:r>
+        <w:rPr>
+          <w:rFonts w:ascii="Times New Roman" w:hAnsi="Times New Roman" w:cs="Times New Roman" w:hint="eastAsia"/>
+          <w:sz w:val="20"/>
+          <w:szCs w:val="20"/>
+          <w:lang w:eastAsia="zh-CN"/>
+        </w:rPr>
+        <w:t xml:space="preserve"> shall return the authenticated user role and session information to the requesting module.</w:t>
       </w:r>
       <w:r>
         <w:rPr>
@@ -7232,7 +7680,32 @@
           <w:sz w:val="20"/>
           <w:szCs w:val="20"/>
         </w:rPr>
-        <w:t xml:space="preserve">The Communication </w:t>
+        <w:t xml:space="preserve">The </w:t>
+      </w:r>
+      <w:r>
+        <w:rPr>
+          <w:rFonts w:ascii="Times New Roman" w:hAnsi="Times New Roman" w:cs="Times New Roman"/>
+          <w:sz w:val="20"/>
+          <w:szCs w:val="20"/>
+        </w:rPr>
+        <w:t>CSM</w:t>
+      </w:r>
+      <w:r>
+        <w:rPr>
+          <w:rFonts w:ascii="Times New Roman" w:hAnsi="Times New Roman" w:cs="Times New Roman"/>
+          <w:sz w:val="20"/>
+          <w:szCs w:val="20"/>
+        </w:rPr>
+        <w:t xml:space="preserve"> shall provide </w:t>
+      </w:r>
+      <w:r>
+        <w:rPr>
+          <w:rFonts w:ascii="Times New Roman" w:hAnsi="Times New Roman" w:cs="Times New Roman"/>
+          <w:sz w:val="20"/>
+          <w:szCs w:val="20"/>
+          <w:lang w:eastAsia="zh-CN"/>
+        </w:rPr>
+        <w:t>CM</w:t>
       </w:r>
       <w:r>
         <w:rPr>
@@ -7241,24 +7714,7 @@
           <w:szCs w:val="20"/>
           <w:lang w:eastAsia="zh-CN"/>
         </w:rPr>
-        <w:t>server</w:t>
-      </w:r>
-      <w:r>
-        <w:rPr>
-          <w:rFonts w:ascii="Times New Roman" w:hAnsi="Times New Roman" w:cs="Times New Roman"/>
-          <w:sz w:val="20"/>
-          <w:szCs w:val="20"/>
-        </w:rPr>
-        <w:t xml:space="preserve"> module shall provide </w:t>
-      </w:r>
-      <w:r>
-        <w:rPr>
-          <w:rFonts w:ascii="Times New Roman" w:hAnsi="Times New Roman" w:cs="Times New Roman" w:hint="eastAsia"/>
-          <w:sz w:val="20"/>
-          <w:szCs w:val="20"/>
-          <w:lang w:eastAsia="zh-CN"/>
-        </w:rPr>
-        <w:t xml:space="preserve">Client module </w:t>
+        <w:t xml:space="preserve"> </w:t>
       </w:r>
       <w:r>
         <w:rPr>
@@ -7338,24 +7794,23 @@
           <w:sz w:val="20"/>
           <w:szCs w:val="20"/>
         </w:rPr>
-        <w:t xml:space="preserve">The Communication </w:t>
-      </w:r>
-      <w:r>
-        <w:rPr>
-          <w:rFonts w:ascii="Times New Roman" w:hAnsi="Times New Roman" w:cs="Times New Roman" w:hint="eastAsia"/>
-          <w:sz w:val="20"/>
-          <w:szCs w:val="20"/>
-          <w:lang w:eastAsia="zh-CN"/>
-        </w:rPr>
-        <w:t>server</w:t>
-      </w:r>
-      <w:r>
-        <w:rPr>
-          <w:rFonts w:ascii="Times New Roman" w:hAnsi="Times New Roman" w:cs="Times New Roman"/>
-          <w:sz w:val="20"/>
-          <w:szCs w:val="20"/>
-        </w:rPr>
-        <w:t xml:space="preserve"> module shall provide a method to submit a message to a chat</w:t>
+        <w:t xml:space="preserve">The </w:t>
+      </w:r>
+      <w:r>
+        <w:rPr>
+          <w:rFonts w:ascii="Times New Roman" w:hAnsi="Times New Roman" w:cs="Times New Roman"/>
+          <w:sz w:val="20"/>
+          <w:szCs w:val="20"/>
+        </w:rPr>
+        <w:t>CSM</w:t>
+      </w:r>
+      <w:r>
+        <w:rPr>
+          <w:rFonts w:ascii="Times New Roman" w:hAnsi="Times New Roman" w:cs="Times New Roman"/>
+          <w:sz w:val="20"/>
+          <w:szCs w:val="20"/>
+        </w:rPr>
+        <w:t xml:space="preserve"> shall provide a method to submit a message to a chat</w:t>
       </w:r>
       <w:r>
         <w:rPr>
@@ -7386,24 +7841,55 @@
           <w:sz w:val="20"/>
           <w:szCs w:val="20"/>
         </w:rPr>
-        <w:t xml:space="preserve">The Communication </w:t>
-      </w:r>
-      <w:r>
-        <w:rPr>
-          <w:rFonts w:ascii="Times New Roman" w:hAnsi="Times New Roman" w:cs="Times New Roman" w:hint="eastAsia"/>
-          <w:sz w:val="20"/>
-          <w:szCs w:val="20"/>
-          <w:lang w:eastAsia="zh-CN"/>
-        </w:rPr>
-        <w:t xml:space="preserve">server </w:t>
-      </w:r>
-      <w:r>
-        <w:rPr>
-          <w:rFonts w:ascii="Times New Roman" w:hAnsi="Times New Roman" w:cs="Times New Roman"/>
-          <w:sz w:val="20"/>
-          <w:szCs w:val="20"/>
-        </w:rPr>
-        <w:t>module shall provide a method to retrieve message history, retrieve unread message, mark message as read.</w:t>
+        <w:t xml:space="preserve">The </w:t>
+      </w:r>
+      <w:r>
+        <w:rPr>
+          <w:rFonts w:ascii="Times New Roman" w:hAnsi="Times New Roman" w:cs="Times New Roman"/>
+          <w:sz w:val="20"/>
+          <w:szCs w:val="20"/>
+        </w:rPr>
+        <w:t>CSM</w:t>
+      </w:r>
+      <w:r>
+        <w:rPr>
+          <w:rFonts w:ascii="Times New Roman" w:hAnsi="Times New Roman" w:cs="Times New Roman"/>
+          <w:sz w:val="20"/>
+          <w:szCs w:val="20"/>
+        </w:rPr>
+        <w:t xml:space="preserve"> shall provide a method to retrieve message history, retrieve unread message</w:t>
+      </w:r>
+      <w:r>
+        <w:rPr>
+          <w:rFonts w:ascii="Times New Roman" w:hAnsi="Times New Roman" w:cs="Times New Roman"/>
+          <w:sz w:val="20"/>
+          <w:szCs w:val="20"/>
+        </w:rPr>
+        <w:t>s</w:t>
+      </w:r>
+      <w:r>
+        <w:rPr>
+          <w:rFonts w:ascii="Times New Roman" w:hAnsi="Times New Roman" w:cs="Times New Roman"/>
+          <w:sz w:val="20"/>
+          <w:szCs w:val="20"/>
+        </w:rPr>
+        <w:t xml:space="preserve">, </w:t>
+      </w:r>
+      <w:r>
+        <w:rPr>
+          <w:rFonts w:ascii="Times New Roman" w:hAnsi="Times New Roman" w:cs="Times New Roman"/>
+          <w:sz w:val="20"/>
+          <w:szCs w:val="20"/>
+        </w:rPr>
+        <w:t xml:space="preserve">and </w:t>
+      </w:r>
+      <w:r>
+        <w:rPr>
+          <w:rFonts w:ascii="Times New Roman" w:hAnsi="Times New Roman" w:cs="Times New Roman"/>
+          <w:sz w:val="20"/>
+          <w:szCs w:val="20"/>
+        </w:rPr>
+        <w:t>mark message as read.</w:t>
       </w:r>
     </w:p>
     <w:p>
@@ -7426,24 +7912,87 @@
           <w:sz w:val="20"/>
           <w:szCs w:val="20"/>
         </w:rPr>
-        <w:t xml:space="preserve">The Communication </w:t>
-      </w:r>
-      <w:r>
-        <w:rPr>
-          <w:rFonts w:ascii="Times New Roman" w:hAnsi="Times New Roman" w:cs="Times New Roman" w:hint="eastAsia"/>
-          <w:sz w:val="20"/>
-          <w:szCs w:val="20"/>
-          <w:lang w:eastAsia="zh-CN"/>
-        </w:rPr>
-        <w:t>server</w:t>
-      </w:r>
-      <w:r>
-        <w:rPr>
-          <w:rFonts w:ascii="Times New Roman" w:hAnsi="Times New Roman" w:cs="Times New Roman"/>
-          <w:sz w:val="20"/>
-          <w:szCs w:val="20"/>
-        </w:rPr>
-        <w:t xml:space="preserve"> module shall notify Client module when new message is received</w:t>
+        <w:t xml:space="preserve">The </w:t>
+      </w:r>
+      <w:r>
+        <w:rPr>
+          <w:rFonts w:ascii="Times New Roman" w:hAnsi="Times New Roman" w:cs="Times New Roman"/>
+          <w:sz w:val="20"/>
+          <w:szCs w:val="20"/>
+        </w:rPr>
+        <w:t>CSM</w:t>
+      </w:r>
+      <w:r>
+        <w:rPr>
+          <w:rFonts w:ascii="Times New Roman" w:hAnsi="Times New Roman" w:cs="Times New Roman"/>
+          <w:sz w:val="20"/>
+          <w:szCs w:val="20"/>
+        </w:rPr>
+        <w:t xml:space="preserve"> shall notify</w:t>
+      </w:r>
+      <w:r>
+        <w:rPr>
+          <w:rFonts w:ascii="Times New Roman" w:hAnsi="Times New Roman" w:cs="Times New Roman"/>
+          <w:sz w:val="20"/>
+          <w:szCs w:val="20"/>
+        </w:rPr>
+        <w:t xml:space="preserve"> the</w:t>
+      </w:r>
+      <w:r>
+        <w:rPr>
+          <w:rFonts w:ascii="Times New Roman" w:hAnsi="Times New Roman" w:cs="Times New Roman"/>
+          <w:sz w:val="20"/>
+          <w:szCs w:val="20"/>
+        </w:rPr>
+        <w:t xml:space="preserve"> </w:t>
+      </w:r>
+      <w:r>
+        <w:rPr>
+          <w:rFonts w:ascii="Times New Roman" w:hAnsi="Times New Roman" w:cs="Times New Roman"/>
+          <w:sz w:val="20"/>
+          <w:szCs w:val="20"/>
+        </w:rPr>
+        <w:t>CM</w:t>
+      </w:r>
+      <w:r>
+        <w:rPr>
+          <w:rFonts w:ascii="Times New Roman" w:hAnsi="Times New Roman" w:cs="Times New Roman"/>
+          <w:sz w:val="20"/>
+          <w:szCs w:val="20"/>
+        </w:rPr>
+        <w:t xml:space="preserve"> when new message</w:t>
+      </w:r>
+      <w:r>
+        <w:rPr>
+          <w:rFonts w:ascii="Times New Roman" w:hAnsi="Times New Roman" w:cs="Times New Roman"/>
+          <w:sz w:val="20"/>
+          <w:szCs w:val="20"/>
+        </w:rPr>
+        <w:t>s</w:t>
+      </w:r>
+      <w:r>
+        <w:rPr>
+          <w:rFonts w:ascii="Times New Roman" w:hAnsi="Times New Roman" w:cs="Times New Roman"/>
+          <w:sz w:val="20"/>
+          <w:szCs w:val="20"/>
+        </w:rPr>
+        <w:t xml:space="preserve"> </w:t>
+      </w:r>
+      <w:r>
+        <w:rPr>
+          <w:rFonts w:ascii="Times New Roman" w:hAnsi="Times New Roman" w:cs="Times New Roman"/>
+          <w:sz w:val="20"/>
+          <w:szCs w:val="20"/>
+        </w:rPr>
+        <w:t>are</w:t>
+      </w:r>
+      <w:r>
+        <w:rPr>
+          <w:rFonts w:ascii="Times New Roman" w:hAnsi="Times New Roman" w:cs="Times New Roman"/>
+          <w:sz w:val="20"/>
+          <w:szCs w:val="20"/>
+        </w:rPr>
+        <w:t xml:space="preserve"> received</w:t>
       </w:r>
     </w:p>
     <w:p>
@@ -7466,24 +8015,63 @@
           <w:sz w:val="20"/>
           <w:szCs w:val="20"/>
         </w:rPr>
-        <w:t xml:space="preserve">The Communication </w:t>
-      </w:r>
-      <w:r>
-        <w:rPr>
-          <w:rFonts w:ascii="Times New Roman" w:hAnsi="Times New Roman" w:cs="Times New Roman" w:hint="eastAsia"/>
-          <w:sz w:val="20"/>
-          <w:szCs w:val="20"/>
-          <w:lang w:eastAsia="zh-CN"/>
-        </w:rPr>
-        <w:t>server</w:t>
-      </w:r>
-      <w:r>
-        <w:rPr>
-          <w:rFonts w:ascii="Times New Roman" w:hAnsi="Times New Roman" w:cs="Times New Roman"/>
-          <w:sz w:val="20"/>
-          <w:szCs w:val="20"/>
-        </w:rPr>
-        <w:t xml:space="preserve"> module shall provide internal access to the IT module to allow viewing all conversation, all users, </w:t>
+        <w:t xml:space="preserve">The </w:t>
+      </w:r>
+      <w:r>
+        <w:rPr>
+          <w:rFonts w:ascii="Times New Roman" w:hAnsi="Times New Roman" w:cs="Times New Roman"/>
+          <w:sz w:val="20"/>
+          <w:szCs w:val="20"/>
+        </w:rPr>
+        <w:t>CSM</w:t>
+      </w:r>
+      <w:r>
+        <w:rPr>
+          <w:rFonts w:ascii="Times New Roman" w:hAnsi="Times New Roman" w:cs="Times New Roman"/>
+          <w:sz w:val="20"/>
+          <w:szCs w:val="20"/>
+        </w:rPr>
+        <w:t xml:space="preserve"> shall provide internal access to the </w:t>
+      </w:r>
+      <w:r>
+        <w:rPr>
+          <w:rFonts w:ascii="Times New Roman" w:hAnsi="Times New Roman" w:cs="Times New Roman"/>
+          <w:sz w:val="20"/>
+          <w:szCs w:val="20"/>
+        </w:rPr>
+        <w:t>IM</w:t>
+      </w:r>
+      <w:r>
+        <w:rPr>
+          <w:rFonts w:ascii="Times New Roman" w:hAnsi="Times New Roman" w:cs="Times New Roman"/>
+          <w:sz w:val="20"/>
+          <w:szCs w:val="20"/>
+        </w:rPr>
+        <w:t xml:space="preserve"> to allow </w:t>
+      </w:r>
+      <w:r>
+        <w:rPr>
+          <w:rFonts w:ascii="Times New Roman" w:hAnsi="Times New Roman" w:cs="Times New Roman"/>
+          <w:sz w:val="20"/>
+          <w:szCs w:val="20"/>
+        </w:rPr>
+        <w:t>access</w:t>
+      </w:r>
+      <w:r>
+        <w:rPr>
+          <w:rFonts w:ascii="Times New Roman" w:hAnsi="Times New Roman" w:cs="Times New Roman"/>
+          <w:sz w:val="20"/>
+          <w:szCs w:val="20"/>
+        </w:rPr>
+        <w:t xml:space="preserve"> </w:t>
+      </w:r>
+      <w:r>
+        <w:rPr>
+          <w:rFonts w:ascii="Times New Roman" w:hAnsi="Times New Roman" w:cs="Times New Roman"/>
+          <w:sz w:val="20"/>
+          <w:szCs w:val="20"/>
+        </w:rPr>
+        <w:t xml:space="preserve">to the </w:t>
       </w:r>
       <w:r>
         <w:rPr>
@@ -7499,7 +8087,47 @@
           <w:sz w:val="20"/>
           <w:szCs w:val="20"/>
         </w:rPr>
-        <w:t>by user, and message history by chat.</w:t>
+        <w:t>of all</w:t>
+      </w:r>
+      <w:r>
+        <w:rPr>
+          <w:rFonts w:ascii="Times New Roman" w:hAnsi="Times New Roman" w:cs="Times New Roman"/>
+          <w:sz w:val="20"/>
+          <w:szCs w:val="20"/>
+        </w:rPr>
+        <w:t xml:space="preserve"> user</w:t>
+      </w:r>
+      <w:r>
+        <w:rPr>
+          <w:rFonts w:ascii="Times New Roman" w:hAnsi="Times New Roman" w:cs="Times New Roman"/>
+          <w:sz w:val="20"/>
+          <w:szCs w:val="20"/>
+        </w:rPr>
+        <w:t>s</w:t>
+      </w:r>
+      <w:r>
+        <w:rPr>
+          <w:rFonts w:ascii="Times New Roman" w:hAnsi="Times New Roman" w:cs="Times New Roman"/>
+          <w:sz w:val="20"/>
+          <w:szCs w:val="20"/>
+        </w:rPr>
+        <w:t xml:space="preserve">, and </w:t>
+      </w:r>
+      <w:r>
+        <w:rPr>
+          <w:rFonts w:ascii="Times New Roman" w:hAnsi="Times New Roman" w:cs="Times New Roman"/>
+          <w:sz w:val="20"/>
+          <w:szCs w:val="20"/>
+        </w:rPr>
+        <w:t>contents of each chat within those lists</w:t>
+      </w:r>
+      <w:r>
+        <w:rPr>
+          <w:rFonts w:ascii="Times New Roman" w:hAnsi="Times New Roman" w:cs="Times New Roman"/>
+          <w:sz w:val="20"/>
+          <w:szCs w:val="20"/>
+        </w:rPr>
+        <w:t>.</w:t>
       </w:r>
     </w:p>
     <w:p>
@@ -7532,7 +8160,25 @@
           <w:szCs w:val="20"/>
           <w:lang w:eastAsia="zh-CN"/>
         </w:rPr>
-        <w:t xml:space="preserve">he communication server module shall handle concurrent service </w:t>
+        <w:t xml:space="preserve">he </w:t>
+      </w:r>
+      <w:r>
+        <w:rPr>
+          <w:rFonts w:ascii="Times New Roman" w:hAnsi="Times New Roman" w:cs="Times New Roman"/>
+          <w:sz w:val="20"/>
+          <w:szCs w:val="20"/>
+          <w:lang w:eastAsia="zh-CN"/>
+        </w:rPr>
+        <w:t>CSM</w:t>
+      </w:r>
+      <w:r>
+        <w:rPr>
+          <w:rFonts w:ascii="Times New Roman" w:hAnsi="Times New Roman" w:cs="Times New Roman" w:hint="eastAsia"/>
+          <w:sz w:val="20"/>
+          <w:szCs w:val="20"/>
+          <w:lang w:eastAsia="zh-CN"/>
+        </w:rPr>
+        <w:t xml:space="preserve"> shall handle concurrent service </w:t>
       </w:r>
       <w:r>
         <w:rPr>
@@ -7550,7 +8196,16 @@
           <w:szCs w:val="20"/>
           <w:lang w:eastAsia="zh-CN"/>
         </w:rPr>
-        <w:t xml:space="preserve"> from multiple Client modules and IT modules</w:t>
+        <w:t xml:space="preserve"> from multiple </w:t>
+      </w:r>
+      <w:r>
+        <w:rPr>
+          <w:rFonts w:ascii="Times New Roman" w:hAnsi="Times New Roman" w:cs="Times New Roman"/>
+          <w:sz w:val="20"/>
+          <w:szCs w:val="20"/>
+          <w:lang w:eastAsia="zh-CN"/>
+        </w:rPr>
+        <w:t>ULMs, CMs, and IMs</w:t>
       </w:r>
     </w:p>
     <w:p>
@@ -7574,7 +8229,43 @@
           <w:szCs w:val="20"/>
           <w:lang w:eastAsia="zh-CN"/>
         </w:rPr>
-        <w:t>The communication server module shall provide the IT module with read-only access interface.</w:t>
+        <w:t xml:space="preserve">The </w:t>
+      </w:r>
+      <w:r>
+        <w:rPr>
+          <w:rFonts w:ascii="Times New Roman" w:hAnsi="Times New Roman" w:cs="Times New Roman"/>
+          <w:sz w:val="20"/>
+          <w:szCs w:val="20"/>
+          <w:lang w:eastAsia="zh-CN"/>
+        </w:rPr>
+        <w:t>CSM</w:t>
+      </w:r>
+      <w:r>
+        <w:rPr>
+          <w:rFonts w:ascii="Times New Roman" w:hAnsi="Times New Roman" w:cs="Times New Roman" w:hint="eastAsia"/>
+          <w:sz w:val="20"/>
+          <w:szCs w:val="20"/>
+          <w:lang w:eastAsia="zh-CN"/>
+        </w:rPr>
+        <w:t xml:space="preserve"> shall provide the </w:t>
+      </w:r>
+      <w:r>
+        <w:rPr>
+          <w:rFonts w:ascii="Times New Roman" w:hAnsi="Times New Roman" w:cs="Times New Roman"/>
+          <w:sz w:val="20"/>
+          <w:szCs w:val="20"/>
+          <w:lang w:eastAsia="zh-CN"/>
+        </w:rPr>
+        <w:t>IM</w:t>
+      </w:r>
+      <w:r>
+        <w:rPr>
+          <w:rFonts w:ascii="Times New Roman" w:hAnsi="Times New Roman" w:cs="Times New Roman" w:hint="eastAsia"/>
+          <w:sz w:val="20"/>
+          <w:szCs w:val="20"/>
+          <w:lang w:eastAsia="zh-CN"/>
+        </w:rPr>
+        <w:t xml:space="preserve"> with read-only access interface.</w:t>
       </w:r>
     </w:p>
     <w:p>

</xml_diff>